<commit_message>
discussão até riqueza e estrutura
</commit_message>
<xml_diff>
--- a/docs/index.docx
+++ b/docs/index.docx
@@ -198,7 +198,7 @@
         <w:t xml:space="preserve"> </w:t>
       </w:r>
       <w:r>
-        <w:t xml:space="preserve">Farias et al. (2012)</w:t>
+        <w:t xml:space="preserve">R. L. Farias et al. (2012)</w:t>
       </w:r>
       <w:r>
         <w:t xml:space="preserve">,</w:t>
@@ -207,7 +207,7 @@
         <w:t xml:space="preserve"> </w:t>
       </w:r>
       <w:r>
-        <w:t xml:space="preserve">Farias et al. (2020)</w:t>
+        <w:t xml:space="preserve">R. L. D. Farias et al. (2020)</w:t>
       </w:r>
       <w:r>
         <w:t xml:space="preserve"> </w:t>
@@ -219,7 +219,7 @@
         <w:t xml:space="preserve"> </w:t>
       </w:r>
       <w:r>
-        <w:t xml:space="preserve">Carvalho et al. (2013a)</w:t>
+        <w:t xml:space="preserve">Carvalho et al. (2013)</w:t>
       </w:r>
       <w:r>
         <w:t xml:space="preserve">). We aim at understanding the temporal differences across these sites. The hypothesis to be tested is that, when analyzed separately, different environments will have specific variables associated with the composition of benthic macroinvertebrates assemblages, and these variables do not reflect the overall set of sites, but each one individually. And that environmental variables are important explicative elements has been tested, confirming the established knowledge that semiarid environments in Brazil are highly spatially segregated with different sets of environmental variables determining the benthic fauna. Before testing this hypothesis, we intend to show that all sites will have different community compositions and different habitat structure.</w:t>
@@ -230,7 +230,17 @@
         <w:pStyle w:val="Corpodetexto"/>
       </w:pPr>
       <w:r>
-        <w:t xml:space="preserve">Maltchik et al. (2010)</w:t>
+        <w:t xml:space="preserve">(</w:t>
+      </w:r>
+      <w:r>
+        <w:rPr>
+          <w:b/>
+          <w:bCs/>
+        </w:rPr>
+        <w:t xml:space="preserve">RN2627?</w:t>
+      </w:r>
+      <w:r>
+        <w:t xml:space="preserve">)</w:t>
       </w:r>
       <w:r>
         <w:t xml:space="preserve">,</w:t>
@@ -239,7 +249,17 @@
         <w:t xml:space="preserve"> </w:t>
       </w:r>
       <w:r>
-        <w:t xml:space="preserve">Medeiros et al. (2024a)</w:t>
+        <w:t xml:space="preserve">(</w:t>
+      </w:r>
+      <w:r>
+        <w:rPr>
+          <w:b/>
+          <w:bCs/>
+        </w:rPr>
+        <w:t xml:space="preserve">RN1965?</w:t>
+      </w:r>
+      <w:r>
+        <w:t xml:space="preserve">)</w:t>
       </w:r>
       <w:r>
         <w:t xml:space="preserve">,</w:t>
@@ -248,7 +268,17 @@
         <w:t xml:space="preserve"> </w:t>
       </w:r>
       <w:r>
-        <w:t xml:space="preserve">Lanés et al. (2018)</w:t>
+        <w:t xml:space="preserve">(</w:t>
+      </w:r>
+      <w:r>
+        <w:rPr>
+          <w:b/>
+          <w:bCs/>
+        </w:rPr>
+        <w:t xml:space="preserve">RN361?</w:t>
+      </w:r>
+      <w:r>
+        <w:t xml:space="preserve">)</w:t>
       </w:r>
     </w:p>
     <w:bookmarkEnd w:id="20"/>
@@ -282,7 +312,17 @@
         <w:t xml:space="preserve"> </w:t>
       </w:r>
       <w:r>
-        <w:t xml:space="preserve">(J. E. de L. Barbosa et al., 2025)</w:t>
+        <w:t xml:space="preserve">(</w:t>
+      </w:r>
+      <w:r>
+        <w:rPr>
+          <w:b/>
+          <w:bCs/>
+        </w:rPr>
+        <w:t xml:space="preserve">RN2966?</w:t>
+      </w:r>
+      <w:r>
+        <w:t xml:space="preserve">)</w:t>
       </w:r>
       <w:r>
         <w:t xml:space="preserve">. The main hydrological feature in the study area is the intermittence of surface water flow of its streams and rivers and, as a consequence, many man-made reservoirs built from the damming of the intermittent streams</w:t>
@@ -291,7 +331,17 @@
         <w:t xml:space="preserve"> </w:t>
       </w:r>
       <w:r>
-        <w:t xml:space="preserve">(Maltchik &amp; Medeiros, 2006)</w:t>
+        <w:t xml:space="preserve">(</w:t>
+      </w:r>
+      <w:r>
+        <w:rPr>
+          <w:b/>
+          <w:bCs/>
+        </w:rPr>
+        <w:t xml:space="preserve">RN2442?</w:t>
+      </w:r>
+      <w:r>
+        <w:t xml:space="preserve">)</w:t>
       </w:r>
       <w:r>
         <w:t xml:space="preserve">. These rivers flow through the</w:t>
@@ -309,7 +359,17 @@
         <w:t xml:space="preserve"> </w:t>
       </w:r>
       <w:r>
-        <w:t xml:space="preserve">(Silva et al., 2017)</w:t>
+        <w:t xml:space="preserve">(</w:t>
+      </w:r>
+      <w:r>
+        <w:rPr>
+          <w:b/>
+          <w:bCs/>
+        </w:rPr>
+        <w:t xml:space="preserve">RN1788?</w:t>
+      </w:r>
+      <w:r>
+        <w:t xml:space="preserve">)</w:t>
       </w:r>
       <w:r>
         <w:t xml:space="preserve">. The climate in the study area is semiarid (BS´h hot and dry) and equatorial (As, dry summer)</w:t>
@@ -318,7 +378,17 @@
         <w:t xml:space="preserve"> </w:t>
       </w:r>
       <w:r>
-        <w:t xml:space="preserve">(Peel et al., 2007)</w:t>
+        <w:t xml:space="preserve">(</w:t>
+      </w:r>
+      <w:r>
+        <w:rPr>
+          <w:b/>
+          <w:bCs/>
+        </w:rPr>
+        <w:t xml:space="preserve">RN2614?</w:t>
+      </w:r>
+      <w:r>
+        <w:t xml:space="preserve">)</w:t>
       </w:r>
       <w:r>
         <w:t xml:space="preserve">. A diverse array of sampling sites was chosen to represent the most common aquatic environment types of semiarid Brazil, with different sets of specificities and across different catchment basins. We sampled six sites, three of which consisted of stream reaches with surface water flow (during the rainy season) or isolated temporary pools (during the dry season) (sites EP, CI, SE) and three sites in artificial reservoirs created from stream impoundment (sites MU, SA, RE). Sampling was conducted during the year of 2006 on four occasions during the rainy (April and June) and dry seasons (September and December) (</w:t>
@@ -338,7 +408,17 @@
         <w:t xml:space="preserve"> </w:t>
       </w:r>
       <w:r>
-        <w:t xml:space="preserve">Medeiros et al. (2008a)</w:t>
+        <w:t xml:space="preserve">(</w:t>
+      </w:r>
+      <w:r>
+        <w:rPr>
+          <w:b/>
+          <w:bCs/>
+        </w:rPr>
+        <w:t xml:space="preserve">RN2491?</w:t>
+      </w:r>
+      <w:r>
+        <w:t xml:space="preserve">)</w:t>
       </w:r>
       <w:r>
         <w:t xml:space="preserve">,</w:t>
@@ -347,7 +427,17 @@
         <w:t xml:space="preserve"> </w:t>
       </w:r>
       <w:r>
-        <w:t xml:space="preserve">Medeiros et al. (2011)</w:t>
+        <w:t xml:space="preserve">(</w:t>
+      </w:r>
+      <w:r>
+        <w:rPr>
+          <w:b/>
+          <w:bCs/>
+        </w:rPr>
+        <w:t xml:space="preserve">RN2692?</w:t>
+      </w:r>
+      <w:r>
+        <w:t xml:space="preserve">)</w:t>
       </w:r>
       <w:r>
         <w:t xml:space="preserve"> </w:t>
@@ -359,7 +449,17 @@
         <w:t xml:space="preserve"> </w:t>
       </w:r>
       <w:r>
-        <w:t xml:space="preserve">Medeiros et al. (2024a)</w:t>
+        <w:t xml:space="preserve">(</w:t>
+      </w:r>
+      <w:r>
+        <w:rPr>
+          <w:b/>
+          <w:bCs/>
+        </w:rPr>
+        <w:t xml:space="preserve">RN1965?</w:t>
+      </w:r>
+      <w:r>
+        <w:t xml:space="preserve">)</w:t>
       </w:r>
       <w:r>
         <w:t xml:space="preserve">.</w:t>
@@ -386,7 +486,17 @@
         <w:t xml:space="preserve"> </w:t>
       </w:r>
       <w:r>
-        <w:t xml:space="preserve">(Maitland, 1990)</w:t>
+        <w:t xml:space="preserve">(</w:t>
+      </w:r>
+      <w:r>
+        <w:rPr>
+          <w:b/>
+          <w:bCs/>
+        </w:rPr>
+        <w:t xml:space="preserve">RN1940?</w:t>
+      </w:r>
+      <w:r>
+        <w:t xml:space="preserve">)</w:t>
       </w:r>
       <w:r>
         <w:t xml:space="preserve">. Sediment composition and the habitat physical structure followed protocols from</w:t>
@@ -395,7 +505,17 @@
         <w:t xml:space="preserve"> </w:t>
       </w:r>
       <w:r>
-        <w:t xml:space="preserve">Pusey et al. (2004)</w:t>
+        <w:t xml:space="preserve">(</w:t>
+      </w:r>
+      <w:r>
+        <w:rPr>
+          <w:b/>
+          <w:bCs/>
+        </w:rPr>
+        <w:t xml:space="preserve">RN2467?</w:t>
+      </w:r>
+      <w:r>
+        <w:t xml:space="preserve">)</w:t>
       </w:r>
       <w:r>
         <w:t xml:space="preserve"> </w:t>
@@ -407,7 +527,17 @@
         <w:t xml:space="preserve"> </w:t>
       </w:r>
       <w:r>
-        <w:t xml:space="preserve">Mugodo et al. (2006)</w:t>
+        <w:t xml:space="preserve">(</w:t>
+      </w:r>
+      <w:r>
+        <w:rPr>
+          <w:b/>
+          <w:bCs/>
+        </w:rPr>
+        <w:t xml:space="preserve">RN2461?</w:t>
+      </w:r>
+      <w:r>
+        <w:t xml:space="preserve">)</w:t>
       </w:r>
       <w:r>
         <w:t xml:space="preserve">, adapted by</w:t>
@@ -416,13 +546,33 @@
         <w:t xml:space="preserve"> </w:t>
       </w:r>
       <w:r>
-        <w:t xml:space="preserve">Medeiros et al. (2008a)</w:t>
+        <w:t xml:space="preserve">(</w:t>
+      </w:r>
+      <w:r>
+        <w:rPr>
+          <w:b/>
+          <w:bCs/>
+        </w:rPr>
+        <w:t xml:space="preserve">RN2491?</w:t>
+      </w:r>
+      <w:r>
+        <w:t xml:space="preserve">)</w:t>
       </w:r>
       <w:r>
         <w:t xml:space="preserve">, where they are estimated from 9 to 12 one meter quadrants along the margins (terrestrial-aquatic interface) and determined by visual estimation of sediment type percentage cover (mud, sand, cobbles, small gravel, large gravel, rocks and bedrock) and of littoral and sub-aquatic structures (macrophytes, littoral grass, leaf litter, attached algae, filamentous algae, overhanging vegetation, submerged vegetation, small woody debris, large woody debris and root masses). At each study site, three samples of benthic macroinvertebrates were collected in the margins using a D type net (40 cm wide and 250 μm) to represent different habitat types. Samples were fixed in situ with 4% formalin and subsequently preserved in 70% ethanol. Macroinvertebrate specimens were sorted and identified to the lowest possible taxonomic level, usually family (</w:t>
       </w:r>
       <w:r>
-        <w:t xml:space="preserve">McCafferty &amp; Provonsha (1983)</w:t>
+        <w:t xml:space="preserve">(</w:t>
+      </w:r>
+      <w:r>
+        <w:rPr>
+          <w:b/>
+          <w:bCs/>
+        </w:rPr>
+        <w:t xml:space="preserve">RN372?</w:t>
+      </w:r>
+      <w:r>
+        <w:t xml:space="preserve">)</w:t>
       </w:r>
       <w:r>
         <w:t xml:space="preserve">,</w:t>
@@ -431,7 +581,17 @@
         <w:t xml:space="preserve"> </w:t>
       </w:r>
       <w:r>
-        <w:t xml:space="preserve">Mugnai et al. (2010)</w:t>
+        <w:t xml:space="preserve">(</w:t>
+      </w:r>
+      <w:r>
+        <w:rPr>
+          <w:b/>
+          <w:bCs/>
+        </w:rPr>
+        <w:t xml:space="preserve">RN782?</w:t>
+      </w:r>
+      <w:r>
+        <w:t xml:space="preserve">)</w:t>
       </w:r>
       <w:r>
         <w:t xml:space="preserve">,</w:t>
@@ -440,7 +600,17 @@
         <w:t xml:space="preserve"> </w:t>
       </w:r>
       <w:r>
-        <w:t xml:space="preserve">Thorp &amp; Covich (2010)</w:t>
+        <w:t xml:space="preserve">(</w:t>
+      </w:r>
+      <w:r>
+        <w:rPr>
+          <w:b/>
+          <w:bCs/>
+        </w:rPr>
+        <w:t xml:space="preserve">RN188?</w:t>
+      </w:r>
+      <w:r>
+        <w:t xml:space="preserve">)</w:t>
       </w:r>
       <w:r>
         <w:t xml:space="preserve"> </w:t>
@@ -452,7 +622,17 @@
         <w:t xml:space="preserve"> </w:t>
       </w:r>
       <w:r>
-        <w:t xml:space="preserve">Merritt et al. (2019)</w:t>
+        <w:t xml:space="preserve">(</w:t>
+      </w:r>
+      <w:r>
+        <w:rPr>
+          <w:b/>
+          <w:bCs/>
+        </w:rPr>
+        <w:t xml:space="preserve">RN2990?</w:t>
+      </w:r>
+      <w:r>
+        <w:t xml:space="preserve">)</w:t>
       </w:r>
       <w:r>
         <w:t xml:space="preserve">, among others).</w:t>
@@ -479,7 +659,17 @@
         <w:t xml:space="preserve"> </w:t>
       </w:r>
       <w:r>
-        <w:t xml:space="preserve">(Sokal &amp; Rohlf, 1995)</w:t>
+        <w:t xml:space="preserve">(</w:t>
+      </w:r>
+      <w:r>
+        <w:rPr>
+          <w:b/>
+          <w:bCs/>
+        </w:rPr>
+        <w:t xml:space="preserve">RN67?</w:t>
+      </w:r>
+      <w:r>
+        <w:t xml:space="preserve">)</w:t>
       </w:r>
       <w:r>
         <w:t xml:space="preserve">.</w:t>
@@ -496,7 +686,17 @@
         <w:t xml:space="preserve"> </w:t>
       </w:r>
       <w:r>
-        <w:t xml:space="preserve">(McCune &amp; Grace, 2002)</w:t>
+        <w:t xml:space="preserve">(</w:t>
+      </w:r>
+      <w:r>
+        <w:rPr>
+          <w:b/>
+          <w:bCs/>
+        </w:rPr>
+        <w:t xml:space="preserve">RN1552?</w:t>
+      </w:r>
+      <w:r>
+        <w:t xml:space="preserve">)</w:t>
       </w:r>
       <w:r>
         <w:t xml:space="preserve">. PCA was performed using the</w:t>
@@ -520,7 +720,17 @@
         <w:t xml:space="preserve"> </w:t>
       </w:r>
       <w:r>
-        <w:t xml:space="preserve">(Lê et al., 2008)</w:t>
+        <w:t xml:space="preserve">(</w:t>
+      </w:r>
+      <w:r>
+        <w:rPr>
+          <w:b/>
+          <w:bCs/>
+        </w:rPr>
+        <w:t xml:space="preserve">RN1482?</w:t>
+      </w:r>
+      <w:r>
+        <w:t xml:space="preserve">)</w:t>
       </w:r>
       <w:r>
         <w:t xml:space="preserve">. All variables were centered and scaled to unit of variance.</w:t>
@@ -546,7 +756,17 @@
         <w:t xml:space="preserve"> </w:t>
       </w:r>
       <w:r>
-        <w:t xml:space="preserve">(Ross et al., 1987)</w:t>
+        <w:t xml:space="preserve">(</w:t>
+      </w:r>
+      <w:r>
+        <w:rPr>
+          <w:b/>
+          <w:bCs/>
+        </w:rPr>
+        <w:t xml:space="preserve">RN636?</w:t>
+      </w:r>
+      <w:r>
+        <w:t xml:space="preserve">)</w:t>
       </w:r>
       <w:r>
         <w:t xml:space="preserve">. Comparisons of density and richness among study sites were tested by one-way ANOVA followed by post hoc multiple comparisons using Tukey’s HSD test (α=0.05)</w:t>
@@ -555,7 +775,17 @@
         <w:t xml:space="preserve"> </w:t>
       </w:r>
       <w:r>
-        <w:t xml:space="preserve">(Zar, 1999)</w:t>
+        <w:t xml:space="preserve">(</w:t>
+      </w:r>
+      <w:r>
+        <w:rPr>
+          <w:b/>
+          <w:bCs/>
+        </w:rPr>
+        <w:t xml:space="preserve">RN158?</w:t>
+      </w:r>
+      <w:r>
+        <w:t xml:space="preserve">)</w:t>
       </w:r>
       <w:r>
         <w:t xml:space="preserve">.</w:t>
@@ -600,7 +830,17 @@
         <w:t xml:space="preserve"> </w:t>
       </w:r>
       <w:r>
-        <w:t xml:space="preserve">Venables &amp; Ripley (2002)</w:t>
+        <w:t xml:space="preserve">(</w:t>
+      </w:r>
+      <w:r>
+        <w:rPr>
+          <w:b/>
+          <w:bCs/>
+        </w:rPr>
+        <w:t xml:space="preserve">RN2991?</w:t>
+      </w:r>
+      <w:r>
+        <w:t xml:space="preserve">)</w:t>
       </w:r>
       <w:r>
         <w:t xml:space="preserve">) as the selection criterion was performed in both directions (forward and backward) to identify the best predictors across subsets of variables (site morphology, water quality, sediment composition and marginal habitat structures) for species richness and density</w:t>
@@ -609,7 +849,17 @@
         <w:t xml:space="preserve"> </w:t>
       </w:r>
       <w:r>
-        <w:t xml:space="preserve">(Vendramin et al., 2020)</w:t>
+        <w:t xml:space="preserve">(</w:t>
+      </w:r>
+      <w:r>
+        <w:rPr>
+          <w:b/>
+          <w:bCs/>
+        </w:rPr>
+        <w:t xml:space="preserve">RN2907?</w:t>
+      </w:r>
+      <w:r>
+        <w:t xml:space="preserve">)</w:t>
       </w:r>
       <w:r>
         <w:t xml:space="preserve">.</w:t>
@@ -626,13 +876,33 @@
         <w:t xml:space="preserve"> </w:t>
       </w:r>
       <w:r>
-        <w:t xml:space="preserve">(Lanés et al., 2018)</w:t>
+        <w:t xml:space="preserve">(</w:t>
+      </w:r>
+      <w:r>
+        <w:rPr>
+          <w:b/>
+          <w:bCs/>
+        </w:rPr>
+        <w:t xml:space="preserve">RN361?</w:t>
+      </w:r>
+      <w:r>
+        <w:t xml:space="preserve">)</w:t>
       </w:r>
       <w:r>
         <w:t xml:space="preserve">. Data were arcsine square-root transformed after relativization and the Bray-Curtis distance was calculated. Significance of groups was tested using the Multi-Response Permutation Procedure (MRPP) (</w:t>
       </w:r>
       <w:r>
-        <w:t xml:space="preserve">Biondini et al. (1985)</w:t>
+        <w:t xml:space="preserve">(</w:t>
+      </w:r>
+      <w:r>
+        <w:rPr>
+          <w:b/>
+          <w:bCs/>
+        </w:rPr>
+        <w:t xml:space="preserve">RN2249?</w:t>
+      </w:r>
+      <w:r>
+        <w:t xml:space="preserve">)</w:t>
       </w:r>
       <w:r>
         <w:t xml:space="preserve">,</w:t>
@@ -641,7 +911,17 @@
         <w:t xml:space="preserve"> </w:t>
       </w:r>
       <w:r>
-        <w:t xml:space="preserve">McCune &amp; Grace (2002)</w:t>
+        <w:t xml:space="preserve">(</w:t>
+      </w:r>
+      <w:r>
+        <w:rPr>
+          <w:b/>
+          <w:bCs/>
+        </w:rPr>
+        <w:t xml:space="preserve">RN1552?</w:t>
+      </w:r>
+      <w:r>
+        <w:t xml:space="preserve">)</w:t>
       </w:r>
       <w:r>
         <w:t xml:space="preserve">). For all MRPP analyses, the A value is presented as a measure of homogeneity degree in a cluster, as compared to random expectation.</w:t>
@@ -670,7 +950,17 @@
         <w:t xml:space="preserve"> </w:t>
       </w:r>
       <w:r>
-        <w:t xml:space="preserve">De Cáceres &amp; Legendre (2009)</w:t>
+        <w:t xml:space="preserve">(</w:t>
+      </w:r>
+      <w:r>
+        <w:rPr>
+          <w:b/>
+          <w:bCs/>
+        </w:rPr>
+        <w:t xml:space="preserve">RN3028?</w:t>
+      </w:r>
+      <w:r>
+        <w:t xml:space="preserve">)</w:t>
       </w:r>
       <w:r>
         <w:t xml:space="preserve">) using the Indicator, or index, Value (IndVal)</w:t>
@@ -679,7 +969,17 @@
         <w:t xml:space="preserve"> </w:t>
       </w:r>
       <w:r>
-        <w:t xml:space="preserve">(De Cáceres et al., 2010)</w:t>
+        <w:t xml:space="preserve">(</w:t>
+      </w:r>
+      <w:r>
+        <w:rPr>
+          <w:b/>
+          <w:bCs/>
+        </w:rPr>
+        <w:t xml:space="preserve">RN3027?</w:t>
+      </w:r>
+      <w:r>
+        <w:t xml:space="preserve">)</w:t>
       </w:r>
       <w:r>
         <w:t xml:space="preserve">. The Indicator Value was calculated according to the method proposed by</w:t>
@@ -688,7 +988,17 @@
         <w:t xml:space="preserve"> </w:t>
       </w:r>
       <w:r>
-        <w:t xml:space="preserve">Dufrene &amp; Legendre (1997)</w:t>
+        <w:t xml:space="preserve">(</w:t>
+      </w:r>
+      <w:r>
+        <w:rPr>
+          <w:b/>
+          <w:bCs/>
+        </w:rPr>
+        <w:t xml:space="preserve">RN2094?</w:t>
+      </w:r>
+      <w:r>
+        <w:t xml:space="preserve">)</w:t>
       </w:r>
       <w:r>
         <w:t xml:space="preserve">. This value was then tested for statistical significance by means of permutations (999 repetitions). Further explorations of species ecological preferences was performed using Multilevel Pattern Analysis with the</w:t>
@@ -713,13 +1023,33 @@
         <w:t xml:space="preserve"> </w:t>
       </w:r>
       <w:r>
-        <w:t xml:space="preserve">(De Cáceres et al., 2010)</w:t>
+        <w:t xml:space="preserve">(</w:t>
+      </w:r>
+      <w:r>
+        <w:rPr>
+          <w:b/>
+          <w:bCs/>
+        </w:rPr>
+        <w:t xml:space="preserve">RN3027?</w:t>
+      </w:r>
+      <w:r>
+        <w:t xml:space="preserve">)</w:t>
       </w:r>
       <w:r>
         <w:t xml:space="preserve">, based on correlation indices and the Pearson’s phi coefficient of association (</w:t>
       </w:r>
       <w:r>
-        <w:t xml:space="preserve">Chytrý et al. (2002)</w:t>
+        <w:t xml:space="preserve">(</w:t>
+      </w:r>
+      <w:r>
+        <w:rPr>
+          <w:b/>
+          <w:bCs/>
+        </w:rPr>
+        <w:t xml:space="preserve">RN3026?</w:t>
+      </w:r>
+      <w:r>
+        <w:t xml:space="preserve">)</w:t>
       </w:r>
       <w:r>
         <w:t xml:space="preserve">,</w:t>
@@ -728,7 +1058,17 @@
         <w:t xml:space="preserve"> </w:t>
       </w:r>
       <w:r>
-        <w:t xml:space="preserve">De Cáceres &amp; Legendre (2009)</w:t>
+        <w:t xml:space="preserve">(</w:t>
+      </w:r>
+      <w:r>
+        <w:rPr>
+          <w:b/>
+          <w:bCs/>
+        </w:rPr>
+        <w:t xml:space="preserve">RN3028?</w:t>
+      </w:r>
+      <w:r>
+        <w:t xml:space="preserve">)</w:t>
       </w:r>
       <w:r>
         <w:t xml:space="preserve">). This coefficient is a measure of the correlation between two binary vectors. Phi was based on the presence–absence community matrix</w:t>
@@ -737,7 +1077,17 @@
         <w:t xml:space="preserve"> </w:t>
       </w:r>
       <w:r>
-        <w:t xml:space="preserve">(De Cáceres et al., 2010)</w:t>
+        <w:t xml:space="preserve">(</w:t>
+      </w:r>
+      <w:r>
+        <w:rPr>
+          <w:b/>
+          <w:bCs/>
+        </w:rPr>
+        <w:t xml:space="preserve">RN3027?</w:t>
+      </w:r>
+      <w:r>
+        <w:t xml:space="preserve">)</w:t>
       </w:r>
       <w:r>
         <w:t xml:space="preserve"> </w:t>
@@ -749,7 +1099,17 @@
         <w:t xml:space="preserve"> </w:t>
       </w:r>
       <w:r>
-        <w:t xml:space="preserve">(Tichý &amp; Chytry, 2006)</w:t>
+        <w:t xml:space="preserve">(</w:t>
+      </w:r>
+      <w:r>
+        <w:rPr>
+          <w:b/>
+          <w:bCs/>
+        </w:rPr>
+        <w:t xml:space="preserve">RN3029?</w:t>
+      </w:r>
+      <w:r>
+        <w:t xml:space="preserve">)</w:t>
       </w:r>
       <w:r>
         <w:t xml:space="preserve">.</w:t>
@@ -766,7 +1126,17 @@
         <w:t xml:space="preserve"> </w:t>
       </w:r>
       <w:r>
-        <w:t xml:space="preserve">Legendre &amp; Anderson (1999)</w:t>
+        <w:t xml:space="preserve">(</w:t>
+      </w:r>
+      <w:r>
+        <w:rPr>
+          <w:b/>
+          <w:bCs/>
+        </w:rPr>
+        <w:t xml:space="preserve">RN2969?</w:t>
+      </w:r>
+      <w:r>
+        <w:t xml:space="preserve">)</w:t>
       </w:r>
       <w:r>
         <w:t xml:space="preserve">), implemented by the</w:t>
@@ -790,7 +1160,17 @@
         <w:t xml:space="preserve"> </w:t>
       </w:r>
       <w:r>
-        <w:t xml:space="preserve">(Oksanen et al., 2020)</w:t>
+        <w:t xml:space="preserve">(</w:t>
+      </w:r>
+      <w:r>
+        <w:rPr>
+          <w:b/>
+          <w:bCs/>
+        </w:rPr>
+        <w:t xml:space="preserve">RN2832?</w:t>
+      </w:r>
+      <w:r>
+        <w:t xml:space="preserve">)</w:t>
       </w:r>
       <w:r>
         <w:t xml:space="preserve">, between each group of environmental variables (explanatory predictors) (site morphology, water quality, sediment composition and marginal habitat structure) and the community composition density matrix (response matrix) to see which environmental/habitat variables were the most important for determining each benthic community composition</w:t>
@@ -799,7 +1179,17 @@
         <w:t xml:space="preserve"> </w:t>
       </w:r>
       <w:r>
-        <w:t xml:space="preserve">(Lanés et al., 2018)</w:t>
+        <w:t xml:space="preserve">(</w:t>
+      </w:r>
+      <w:r>
+        <w:rPr>
+          <w:b/>
+          <w:bCs/>
+        </w:rPr>
+        <w:t xml:space="preserve">RN361?</w:t>
+      </w:r>
+      <w:r>
+        <w:t xml:space="preserve">)</w:t>
       </w:r>
       <w:r>
         <w:t xml:space="preserve">. Multicollinearity across explanatory (environmental) variables was assessed using the Variance Inflation Factor (VIF) function (</w:t>
@@ -818,7 +1208,17 @@
         <w:t xml:space="preserve"> </w:t>
       </w:r>
       <w:r>
-        <w:t xml:space="preserve">(Oksanen et al., 2020)</w:t>
+        <w:t xml:space="preserve">(</w:t>
+      </w:r>
+      <w:r>
+        <w:rPr>
+          <w:b/>
+          <w:bCs/>
+        </w:rPr>
+        <w:t xml:space="preserve">RN2832?</w:t>
+      </w:r>
+      <w:r>
+        <w:t xml:space="preserve">)</w:t>
       </w:r>
       <w:r>
         <w:t xml:space="preserve">. To identify a parsimonious model, forward and backward stepwise model selection based on permutation tests was applied, retaining only predictors that significantly explained additional variation in community structure. The final RDA model was re-fitted using the selected variables and re-evaluated for collinearity and significance. Both sequential (Type I) and marginal (Type III) permutation tests were conducted, with marginal effects used to infer the independent contribution of each predictor.</w:t>
@@ -835,7 +1235,17 @@
         <w:t xml:space="preserve"> </w:t>
       </w:r>
       <w:r>
-        <w:t xml:space="preserve">(Legendre &amp; Gallagher, 2001)</w:t>
+        <w:t xml:space="preserve">(</w:t>
+      </w:r>
+      <w:r>
+        <w:rPr>
+          <w:b/>
+          <w:bCs/>
+        </w:rPr>
+        <w:t xml:space="preserve">RN2904?</w:t>
+      </w:r>
+      <w:r>
+        <w:t xml:space="preserve">)</w:t>
       </w:r>
       <w:r>
         <w:t xml:space="preserve">. Only taxa with the highest absolute scores on the first canonical axis were labeled in the final ordination diagram. Environmental variables were transformed as previously stated for PCA. All statistical analyses were performed in the statistical environment of R v.2.9.0</w:t>
@@ -844,7 +1254,17 @@
         <w:t xml:space="preserve"> </w:t>
       </w:r>
       <w:r>
-        <w:t xml:space="preserve">(Team, 2017)</w:t>
+        <w:t xml:space="preserve">(</w:t>
+      </w:r>
+      <w:r>
+        <w:rPr>
+          <w:b/>
+          <w:bCs/>
+        </w:rPr>
+        <w:t xml:space="preserve">RN2774?</w:t>
+      </w:r>
+      <w:r>
+        <w:t xml:space="preserve">)</w:t>
       </w:r>
       <w:r>
         <w:t xml:space="preserve">.</w:t>
@@ -1386,7 +1806,17 @@
         <w:t xml:space="preserve"> </w:t>
       </w:r>
       <w:r>
-        <w:t xml:space="preserve">Medeiros et al. (2008b)</w:t>
+        <w:t xml:space="preserve">(</w:t>
+      </w:r>
+      <w:r>
+        <w:rPr>
+          <w:b/>
+          <w:bCs/>
+        </w:rPr>
+        <w:t xml:space="preserve">medeiros2008?</w:t>
+      </w:r>
+      <w:r>
+        <w:t xml:space="preserve">)</w:t>
       </w:r>
       <w:r>
         <w:t xml:space="preserve">, with different sets of specificities and across different catchment basins. Principal Component Analysis separated the study sites in a gradient, along the first axis, based on their major environmental characteristics. Larger reservoirs being positively associated with large-scale morphological variables (such as river length, site altitude and width), whereas river sites were associated with a more diverse array of variables, including small-scale morphology variables (e.g. margins depth and water temperature). Among the habitat structure variations, the presence of underwater root masses and overhanging vegetation, were also important to describe stream sites, those being narrower and deeper in their margins. These sites were also more likely to have a nearby denser riparian vegetation. Larger reservoirs were mostly associated with a muddy substrate whereas river sites included a more diverse array of substrates, the most important being sand and gravel. This is expected based on presence of water flow in the streams sites during the rainy season</w:t>
@@ -1395,7 +1825,17 @@
         <w:t xml:space="preserve"> </w:t>
       </w:r>
       <w:r>
-        <w:t xml:space="preserve">Cobb et al. (1992a)</w:t>
+        <w:t xml:space="preserve">(</w:t>
+      </w:r>
+      <w:r>
+        <w:rPr>
+          <w:b/>
+          <w:bCs/>
+        </w:rPr>
+        <w:t xml:space="preserve">cobb1992?</w:t>
+      </w:r>
+      <w:r>
+        <w:t xml:space="preserve">)</w:t>
       </w:r>
       <w:r>
         <w:t xml:space="preserve">. Other variables such as slope (morphology), submerged vegetation and leaf litter (habitat structure) and water velocity (water quality) were important in explaining specific sites at given sampling occasions. These variables were associated with temporal changes, from river bed pools to flowing waters in stream sites during the rainy season. It is important to note that, based on PCA, the small reservoir site (RE) showed environmental characteristics more closely associated with the streams sites. That is the result of its relative small size and greater subjectivity to water flow during the rainy season. Despite these results, a temporal gradient was not observed, since the time scale of our sampling design is not able to closely follow temporal changes in the stream sites</w:t>
@@ -1404,7 +1844,17 @@
         <w:t xml:space="preserve"> </w:t>
       </w:r>
       <w:r>
-        <w:t xml:space="preserve">Rocha et al. (2012)</w:t>
+        <w:t xml:space="preserve">(</w:t>
+      </w:r>
+      <w:r>
+        <w:rPr>
+          <w:b/>
+          <w:bCs/>
+        </w:rPr>
+        <w:t xml:space="preserve">rocha2012?</w:t>
+      </w:r>
+      <w:r>
+        <w:t xml:space="preserve">)</w:t>
       </w:r>
       <w:r>
         <w:t xml:space="preserve">.</w:t>
@@ -1440,7 +1890,7 @@
         <w:t xml:space="preserve"> </w:t>
       </w:r>
       <w:r>
-        <w:t xml:space="preserve">Carvalho et al. (2013b)</w:t>
+        <w:t xml:space="preserve">Carvalho et al. (2013)</w:t>
       </w:r>
       <w:r>
         <w:t xml:space="preserve">;</w:t>
@@ -1449,7 +1899,17 @@
         <w:t xml:space="preserve"> </w:t>
       </w:r>
       <w:r>
-        <w:t xml:space="preserve">De Lira Azevêdo et al. (2017)</w:t>
+        <w:t xml:space="preserve">(</w:t>
+      </w:r>
+      <w:r>
+        <w:rPr>
+          <w:b/>
+          <w:bCs/>
+        </w:rPr>
+        <w:t xml:space="preserve">deliraazevêdo2017?</w:t>
+      </w:r>
+      <w:r>
+        <w:t xml:space="preserve">)</w:t>
       </w:r>
       <w:r>
         <w:t xml:space="preserve">, where assemblages are typically dominated by a limited number of tolerant and generalist taxa, particularly Chironomidae, Oligochaeta and Mollusca. Sampling sites were generally different in macroinvertebrate rarefied richness but not in density of individuals, where CI and RE had significantly higher rarefied richness when compared to the other study sites. Nonetheless, species richness varied widely between sampling occasions (with the exception of MU), rendering averaged values misleading. Overall, stream sites tended to have greater values of richness. The most important variables negatively correlated with taxa richness were site width, river length and the absence of water velocity, all indicative of fewer species. Higher water temperatures were associated with greater diversity. Among the substrate and habitat composition variables, gravel was the only significant predictor for substrate, whereas leaf litter and algal cover were positively associated with richness. Other predictors such as roots and littoral grass may have been important showing marginal effects. All variables negatively associated with taxa richness are also descriptive of the reservoir sites. Studies show that in dryland aquatic systems, reservoirs tend to have fewer species when compared with the more dynamic and habitat-rich streams and rivers</w:t>
@@ -1458,7 +1918,17 @@
         <w:t xml:space="preserve"> </w:t>
       </w:r>
       <w:r>
-        <w:t xml:space="preserve">Cobb et al. (1992b)</w:t>
+        <w:t xml:space="preserve">(</w:t>
+      </w:r>
+      <w:r>
+        <w:rPr>
+          <w:b/>
+          <w:bCs/>
+        </w:rPr>
+        <w:t xml:space="preserve">cobb1992a?</w:t>
+      </w:r>
+      <w:r>
+        <w:t xml:space="preserve">)</w:t>
       </w:r>
       <w:r>
         <w:t xml:space="preserve">.</w:t>
@@ -1467,7 +1937,17 @@
         <w:t xml:space="preserve"> </w:t>
       </w:r>
       <w:r>
-        <w:t xml:space="preserve">Medeiros et al. (2024b)</w:t>
+        <w:t xml:space="preserve">(</w:t>
+      </w:r>
+      <w:r>
+        <w:rPr>
+          <w:b/>
+          <w:bCs/>
+        </w:rPr>
+        <w:t xml:space="preserve">medeiros2024?</w:t>
+      </w:r>
+      <w:r>
+        <w:t xml:space="preserve">)</w:t>
       </w:r>
       <w:r>
         <w:t xml:space="preserve"> </w:t>
@@ -1479,7 +1959,17 @@
         <w:t xml:space="preserve"> </w:t>
       </w:r>
       <w:r>
-        <w:t xml:space="preserve">Brito et al. (2020)</w:t>
+        <w:t xml:space="preserve">(</w:t>
+      </w:r>
+      <w:r>
+        <w:rPr>
+          <w:b/>
+          <w:bCs/>
+        </w:rPr>
+        <w:t xml:space="preserve">brito2020?</w:t>
+      </w:r>
+      <w:r>
+        <w:t xml:space="preserve">)</w:t>
       </w:r>
       <w:r>
         <w:t xml:space="preserve"> </w:t>
@@ -1491,7 +1981,17 @@
         <w:t xml:space="preserve"> </w:t>
       </w:r>
       <w:r>
-        <w:t xml:space="preserve">Castro et al. (2026)</w:t>
+        <w:t xml:space="preserve">(</w:t>
+      </w:r>
+      <w:r>
+        <w:rPr>
+          <w:b/>
+          <w:bCs/>
+        </w:rPr>
+        <w:t xml:space="preserve">castro2026?</w:t>
+      </w:r>
+      <w:r>
+        <w:t xml:space="preserve">)</w:t>
       </w:r>
       <w:r>
         <w:t xml:space="preserve">), favoring invasive and opportunistic species. The decline in habitat variability leads to the dominance of these species, reducing overall diversity in dryland aquatic systems.</w:t>
@@ -1518,7 +2018,17 @@
         <w:t xml:space="preserve"> </w:t>
       </w:r>
       <w:r>
-        <w:t xml:space="preserve">Rocha et al. (2012)</w:t>
+        <w:t xml:space="preserve">(</w:t>
+      </w:r>
+      <w:r>
+        <w:rPr>
+          <w:b/>
+          <w:bCs/>
+        </w:rPr>
+        <w:t xml:space="preserve">rocha2012?</w:t>
+      </w:r>
+      <w:r>
+        <w:t xml:space="preserve">)</w:t>
       </w:r>
       <w:r>
         <w:t xml:space="preserve"> </w:t>
@@ -1538,7 +2048,17 @@
         <w:t xml:space="preserve"> </w:t>
       </w:r>
       <w:r>
-        <w:t xml:space="preserve">J. E. D. L. Barbosa et al. (2012)</w:t>
+        <w:t xml:space="preserve">(</w:t>
+      </w:r>
+      <w:r>
+        <w:rPr>
+          <w:b/>
+          <w:bCs/>
+        </w:rPr>
+        <w:t xml:space="preserve">barbosa2012?</w:t>
+      </w:r>
+      <w:r>
+        <w:t xml:space="preserve">)</w:t>
       </w:r>
       <w:r>
         <w:t xml:space="preserve"> </w:t>
@@ -1550,7 +2070,17 @@
         <w:t xml:space="preserve"> </w:t>
       </w:r>
       <w:r>
-        <w:t xml:space="preserve">J. E. D. L. Barbosa et al. (2025a)</w:t>
+        <w:t xml:space="preserve">(</w:t>
+      </w:r>
+      <w:r>
+        <w:rPr>
+          <w:b/>
+          <w:bCs/>
+        </w:rPr>
+        <w:t xml:space="preserve">barbosa2025?</w:t>
+      </w:r>
+      <w:r>
+        <w:t xml:space="preserve">)</w:t>
       </w:r>
       <w:r>
         <w:t xml:space="preserve"> </w:t>
@@ -1559,7 +2089,17 @@
         <w:t xml:space="preserve">report that Oligochaeta can reach as much as 37% of the total macroinvertebrate community in some semiarid systems of Brazil, being primary indicators of high organic loads and sediment stability found in reservoirs (</w:t>
       </w:r>
       <w:r>
-        <w:t xml:space="preserve">Azevêdo et al. (2017)</w:t>
+        <w:t xml:space="preserve">(</w:t>
+      </w:r>
+      <w:r>
+        <w:rPr>
+          <w:b/>
+          <w:bCs/>
+        </w:rPr>
+        <w:t xml:space="preserve">azevêdo2017?</w:t>
+      </w:r>
+      <w:r>
+        <w:t xml:space="preserve">)</w:t>
       </w:r>
       <w:r>
         <w:t xml:space="preserve">;</w:t>
@@ -1568,13 +2108,33 @@
         <w:t xml:space="preserve"> </w:t>
       </w:r>
       <w:r>
-        <w:t xml:space="preserve">J. E. D. L. Barbosa et al. (2025b)</w:t>
+        <w:t xml:space="preserve">(</w:t>
+      </w:r>
+      <w:r>
+        <w:rPr>
+          <w:b/>
+          <w:bCs/>
+        </w:rPr>
+        <w:t xml:space="preserve">barbosa2025?</w:t>
+      </w:r>
+      <w:r>
+        <w:t xml:space="preserve">)</w:t>
       </w:r>
       <w:r>
         <w:t xml:space="preserve">). On the other hand, Coenagrionidae is frequently identified in reservoir habitats where aquatic macrophytes (e.g., Salvinia sp. and Pistia sp.) and submerged vegetation are abundant (</w:t>
       </w:r>
       <w:r>
-        <w:t xml:space="preserve">J. E. D. L. Barbosa et al. (2025c)</w:t>
+        <w:t xml:space="preserve">(</w:t>
+      </w:r>
+      <w:r>
+        <w:rPr>
+          <w:b/>
+          <w:bCs/>
+        </w:rPr>
+        <w:t xml:space="preserve">barbosa2025?</w:t>
+      </w:r>
+      <w:r>
+        <w:t xml:space="preserve">)</w:t>
       </w:r>
       <w:r>
         <w:t xml:space="preserve">;</w:t>
@@ -1583,7 +2143,17 @@
         <w:t xml:space="preserve"> </w:t>
       </w:r>
       <w:r>
-        <w:t xml:space="preserve">Medeiros et al. (2024c)</w:t>
+        <w:t xml:space="preserve">(</w:t>
+      </w:r>
+      <w:r>
+        <w:rPr>
+          <w:b/>
+          <w:bCs/>
+        </w:rPr>
+        <w:t xml:space="preserve">medeiros2024?</w:t>
+      </w:r>
+      <w:r>
+        <w:t xml:space="preserve">)</w:t>
       </w:r>
       <w:r>
         <w:t xml:space="preserve">). These plants provide a complex physical structure for colonization that is largely absent in streams because seasonal floods physically remove macrophyte biomass (see</w:t>
@@ -1592,13 +2162,33 @@
         <w:t xml:space="preserve"> </w:t>
       </w:r>
       <w:r>
-        <w:t xml:space="preserve">Medeiros et al. (2008c)</w:t>
+        <w:t xml:space="preserve">(</w:t>
+      </w:r>
+      <w:r>
+        <w:rPr>
+          <w:b/>
+          <w:bCs/>
+        </w:rPr>
+        <w:t xml:space="preserve">medeiros2008?</w:t>
+      </w:r>
+      <w:r>
+        <w:t xml:space="preserve">)</w:t>
       </w:r>
       <w:r>
         <w:t xml:space="preserve">). In this transitional site of the observed gradient, we also find as indicator taxa Conchostraca and Physidae. The former is a temporary water specialist well adapted to boom and bust cycles, characteristic of dryland river systems (</w:t>
       </w:r>
       <w:r>
-        <w:t xml:space="preserve">Bunn et al. (2006)</w:t>
+        <w:t xml:space="preserve">(</w:t>
+      </w:r>
+      <w:r>
+        <w:rPr>
+          <w:b/>
+          <w:bCs/>
+        </w:rPr>
+        <w:t xml:space="preserve">bunn2006?</w:t>
+      </w:r>
+      <w:r>
+        <w:t xml:space="preserve">)</w:t>
       </w:r>
       <w:r>
         <w:t xml:space="preserve">).</w:t>
@@ -1723,7 +2313,7 @@
       </w:r>
     </w:p>
     <w:bookmarkEnd w:id="31"/>
-    <w:bookmarkStart w:id="121" w:name="references"/>
+    <w:bookmarkStart w:id="39" w:name="references"/>
     <w:p>
       <w:pPr>
         <w:pStyle w:val="Ttulo1"/>
@@ -1732,397 +2322,14 @@
         <w:t xml:space="preserve">References</w:t>
       </w:r>
     </w:p>
-    <w:bookmarkStart w:id="120" w:name="refs"/>
-    <w:bookmarkStart w:id="33" w:name="ref-azevêdo2017"/>
+    <w:bookmarkStart w:id="38" w:name="refs"/>
+    <w:bookmarkStart w:id="33" w:name="ref-carvalho2013"/>
     <w:p>
       <w:pPr>
         <w:pStyle w:val="Bibliografia"/>
       </w:pPr>
       <w:r>
-        <w:t xml:space="preserve">Azevêdo, E. de L., Barbosa, J. E. de L., Viana, L. G., Anacleto, M. J. P., Callisto, M., &amp; Molozzi, J. (2017). Application of a statistical model for the assessment of environmental quality in neotropical semi-arid reservoirs.</w:t>
-      </w:r>
-      <w:r>
-        <w:t xml:space="preserve"> </w:t>
-      </w:r>
-      <w:r>
-        <w:rPr>
-          <w:i/>
-          <w:iCs/>
-        </w:rPr>
-        <w:t xml:space="preserve">Environmental Monitoring and Assessment</w:t>
-      </w:r>
-      <w:r>
-        <w:t xml:space="preserve">,</w:t>
-      </w:r>
-      <w:r>
-        <w:t xml:space="preserve"> </w:t>
-      </w:r>
-      <w:r>
-        <w:rPr>
-          <w:i/>
-          <w:iCs/>
-        </w:rPr>
-        <w:t xml:space="preserve">189</w:t>
-      </w:r>
-      <w:r>
-        <w:t xml:space="preserve">(2), 65.</w:t>
-      </w:r>
-      <w:r>
-        <w:t xml:space="preserve"> </w:t>
-      </w:r>
-      <w:hyperlink r:id="rId32">
-        <w:r>
-          <w:rPr>
-            <w:rStyle w:val="Hyperlink"/>
-          </w:rPr>
-          <w:t xml:space="preserve">https://doi.org/10.1007/s10661-016-5723-3</w:t>
-        </w:r>
-      </w:hyperlink>
-    </w:p>
-    <w:bookmarkEnd w:id="33"/>
-    <w:bookmarkStart w:id="35" w:name="ref-barbosa2012"/>
-    <w:p>
-      <w:pPr>
-        <w:pStyle w:val="Bibliografia"/>
-      </w:pPr>
-      <w:r>
-        <w:t xml:space="preserve">Barbosa, J. E. D. L., Medeiros, E. S. F., Brasil, J., Cordeiro, R. D. S., Crispim, M. C. B., &amp; Silva, G. H. G. D. (2012). Aquatic systems in semi-arid Brazil: limnology and management.</w:t>
-      </w:r>
-      <w:r>
-        <w:t xml:space="preserve"> </w:t>
-      </w:r>
-      <w:r>
-        <w:rPr>
-          <w:i/>
-          <w:iCs/>
-        </w:rPr>
-        <w:t xml:space="preserve">Acta Limnologica Brasiliensia</w:t>
-      </w:r>
-      <w:r>
-        <w:t xml:space="preserve">,</w:t>
-      </w:r>
-      <w:r>
-        <w:t xml:space="preserve"> </w:t>
-      </w:r>
-      <w:r>
-        <w:rPr>
-          <w:i/>
-          <w:iCs/>
-        </w:rPr>
-        <w:t xml:space="preserve">24</w:t>
-      </w:r>
-      <w:r>
-        <w:t xml:space="preserve">(1), 103–118.</w:t>
-      </w:r>
-      <w:r>
-        <w:t xml:space="preserve"> </w:t>
-      </w:r>
-      <w:hyperlink r:id="rId34">
-        <w:r>
-          <w:rPr>
-            <w:rStyle w:val="Hyperlink"/>
-          </w:rPr>
-          <w:t xml:space="preserve">https://doi.org/10.1590/S2179-975X2012005000030</w:t>
-        </w:r>
-      </w:hyperlink>
-    </w:p>
-    <w:bookmarkEnd w:id="35"/>
-    <w:bookmarkStart w:id="37" w:name="ref-barbosa2025"/>
-    <w:p>
-      <w:pPr>
-        <w:pStyle w:val="Bibliografia"/>
-      </w:pPr>
-      <w:r>
-        <w:t xml:space="preserve">Barbosa, J. E. D. L., Severiano, J. D. S., Costa, S. Y. L., Terra, B. D. F., Medeiros, E. S. F., &amp; Menezes, R. F. (2025a).</w:t>
-      </w:r>
-      <w:r>
-        <w:t xml:space="preserve"> </w:t>
-      </w:r>
-      <w:r>
-        <w:rPr>
-          <w:i/>
-          <w:iCs/>
-        </w:rPr>
-        <w:t xml:space="preserve">Rivers of the Northeast</w:t>
-      </w:r>
-      <w:r>
-        <w:t xml:space="preserve"> </w:t>
-      </w:r>
-      <w:r>
-        <w:t xml:space="preserve">(pp. 437–465). Elsevier.</w:t>
-      </w:r>
-      <w:r>
-        <w:t xml:space="preserve"> </w:t>
-      </w:r>
-      <w:hyperlink r:id="rId36">
-        <w:r>
-          <w:rPr>
-            <w:rStyle w:val="Hyperlink"/>
-          </w:rPr>
-          <w:t xml:space="preserve">https://doi.org/10.1016/B978-0-12-823429-7.00009-4</w:t>
-        </w:r>
-      </w:hyperlink>
-    </w:p>
-    <w:bookmarkEnd w:id="37"/>
-    <w:bookmarkStart w:id="38" w:name="ref-barbosa2025a"/>
-    <w:p>
-      <w:pPr>
-        <w:pStyle w:val="Bibliografia"/>
-      </w:pPr>
-      <w:r>
-        <w:t xml:space="preserve">Barbosa, J. E. D. L., Severiano, J. D. S., Costa, S. Y. L., Terra, B. D. F., Medeiros, E. S. F., &amp; Menezes, R. F. (2025b).</w:t>
-      </w:r>
-      <w:r>
-        <w:t xml:space="preserve"> </w:t>
-      </w:r>
-      <w:r>
-        <w:rPr>
-          <w:i/>
-          <w:iCs/>
-        </w:rPr>
-        <w:t xml:space="preserve">Rivers of the Northeast</w:t>
-      </w:r>
-      <w:r>
-        <w:t xml:space="preserve"> </w:t>
-      </w:r>
-      <w:r>
-        <w:t xml:space="preserve">(pp. 437–465). Elsevier.</w:t>
-      </w:r>
-      <w:r>
-        <w:t xml:space="preserve"> </w:t>
-      </w:r>
-      <w:hyperlink r:id="rId36">
-        <w:r>
-          <w:rPr>
-            <w:rStyle w:val="Hyperlink"/>
-          </w:rPr>
-          <w:t xml:space="preserve">https://doi.org/10.1016/B978-0-12-823429-7.00009-4</w:t>
-        </w:r>
-      </w:hyperlink>
-    </w:p>
-    <w:bookmarkEnd w:id="38"/>
-    <w:bookmarkStart w:id="39" w:name="ref-barbosa2025b"/>
-    <w:p>
-      <w:pPr>
-        <w:pStyle w:val="Bibliografia"/>
-      </w:pPr>
-      <w:r>
-        <w:t xml:space="preserve">Barbosa, J. E. D. L., Severiano, J. D. S., Costa, S. Y. L., Terra, B. D. F., Medeiros, E. S. F., &amp; Menezes, R. F. (2025c).</w:t>
-      </w:r>
-      <w:r>
-        <w:t xml:space="preserve"> </w:t>
-      </w:r>
-      <w:r>
-        <w:rPr>
-          <w:i/>
-          <w:iCs/>
-        </w:rPr>
-        <w:t xml:space="preserve">Rivers of the Northeast</w:t>
-      </w:r>
-      <w:r>
-        <w:t xml:space="preserve"> </w:t>
-      </w:r>
-      <w:r>
-        <w:t xml:space="preserve">(pp. 437–465). Elsevier.</w:t>
-      </w:r>
-      <w:r>
-        <w:t xml:space="preserve"> </w:t>
-      </w:r>
-      <w:hyperlink r:id="rId36">
-        <w:r>
-          <w:rPr>
-            <w:rStyle w:val="Hyperlink"/>
-          </w:rPr>
-          <w:t xml:space="preserve">https://doi.org/10.1016/B978-0-12-823429-7.00009-4</w:t>
-        </w:r>
-      </w:hyperlink>
-    </w:p>
-    <w:bookmarkEnd w:id="39"/>
-    <w:bookmarkStart w:id="40" w:name="ref-RN2966"/>
-    <w:p>
-      <w:pPr>
-        <w:pStyle w:val="Bibliografia"/>
-      </w:pPr>
-      <w:r>
-        <w:t xml:space="preserve">Barbosa, J. E. de L., Severiano, J. dos S., Costa, S. Y. L., Terra, B. de F., Medeiros, E. S. F., &amp; Menezes, R. F. (2025). Rivers of the northeast [Book Section]. In M. A. S. Graça, M. Callisto, F. T. de Mello, &amp; D. Rodríguez-Olarte (Eds.),</w:t>
-      </w:r>
-      <w:r>
-        <w:t xml:space="preserve"> </w:t>
-      </w:r>
-      <w:r>
-        <w:rPr>
-          <w:i/>
-          <w:iCs/>
-        </w:rPr>
-        <w:t xml:space="preserve">Rivers of south america</w:t>
-      </w:r>
-      <w:r>
-        <w:t xml:space="preserve"> </w:t>
-      </w:r>
-      <w:r>
-        <w:t xml:space="preserve">(pp. 437–465). Elsevier.</w:t>
-      </w:r>
-      <w:r>
-        <w:t xml:space="preserve"> </w:t>
-      </w:r>
-      <w:hyperlink r:id="rId36">
-        <w:r>
-          <w:rPr>
-            <w:rStyle w:val="Hyperlink"/>
-          </w:rPr>
-          <w:t xml:space="preserve">https://doi.org/10.1016/B978-0-12-823429-7.00009-4</w:t>
-        </w:r>
-      </w:hyperlink>
-    </w:p>
-    <w:bookmarkEnd w:id="40"/>
-    <w:bookmarkStart w:id="42" w:name="ref-RN2249"/>
-    <w:p>
-      <w:pPr>
-        <w:pStyle w:val="Bibliografia"/>
-      </w:pPr>
-      <w:r>
-        <w:t xml:space="preserve">Biondini, M. E., Bonham, C. D., &amp; Redente, E. F. (1985). Secondary successional patterns in a sagebrush (artemisia tridentata) community as they relate to soil disturbance and soil biological activity [Journal Article].</w:t>
-      </w:r>
-      <w:r>
-        <w:t xml:space="preserve"> </w:t>
-      </w:r>
-      <w:r>
-        <w:rPr>
-          <w:i/>
-          <w:iCs/>
-        </w:rPr>
-        <w:t xml:space="preserve">Vegetatio</w:t>
-      </w:r>
-      <w:r>
-        <w:t xml:space="preserve">,</w:t>
-      </w:r>
-      <w:r>
-        <w:t xml:space="preserve"> </w:t>
-      </w:r>
-      <w:r>
-        <w:rPr>
-          <w:i/>
-          <w:iCs/>
-        </w:rPr>
-        <w:t xml:space="preserve">60</w:t>
-      </w:r>
-      <w:r>
-        <w:t xml:space="preserve">(1), 25–36.</w:t>
-      </w:r>
-      <w:r>
-        <w:t xml:space="preserve"> </w:t>
-      </w:r>
-      <w:hyperlink r:id="rId41">
-        <w:r>
-          <w:rPr>
-            <w:rStyle w:val="Hyperlink"/>
-          </w:rPr>
-          <w:t xml:space="preserve">https://doi.org/10.1007/BF00053909</w:t>
-        </w:r>
-      </w:hyperlink>
-    </w:p>
-    <w:bookmarkEnd w:id="42"/>
-    <w:bookmarkStart w:id="44" w:name="ref-brito2020"/>
-    <w:p>
-      <w:pPr>
-        <w:pStyle w:val="Bibliografia"/>
-      </w:pPr>
-      <w:r>
-        <w:t xml:space="preserve">Brito, M. F. G., Daga, V. S., &amp; Vitule, J. R. S. (2020). Fisheries and biotic homogenization of freshwater fish in the Brazilian semiarid region.</w:t>
-      </w:r>
-      <w:r>
-        <w:t xml:space="preserve"> </w:t>
-      </w:r>
-      <w:r>
-        <w:rPr>
-          <w:i/>
-          <w:iCs/>
-        </w:rPr>
-        <w:t xml:space="preserve">Hydrobiologia</w:t>
-      </w:r>
-      <w:r>
-        <w:t xml:space="preserve">,</w:t>
-      </w:r>
-      <w:r>
-        <w:t xml:space="preserve"> </w:t>
-      </w:r>
-      <w:r>
-        <w:rPr>
-          <w:i/>
-          <w:iCs/>
-        </w:rPr>
-        <w:t xml:space="preserve">847</w:t>
-      </w:r>
-      <w:r>
-        <w:t xml:space="preserve">(18), 3877–3895.</w:t>
-      </w:r>
-      <w:r>
-        <w:t xml:space="preserve"> </w:t>
-      </w:r>
-      <w:hyperlink r:id="rId43">
-        <w:r>
-          <w:rPr>
-            <w:rStyle w:val="Hyperlink"/>
-          </w:rPr>
-          <w:t xml:space="preserve">https://doi.org/10.1007/s10750-020-04236-8</w:t>
-        </w:r>
-      </w:hyperlink>
-    </w:p>
-    <w:bookmarkEnd w:id="44"/>
-    <w:bookmarkStart w:id="46" w:name="ref-bunn2006"/>
-    <w:p>
-      <w:pPr>
-        <w:pStyle w:val="Bibliografia"/>
-      </w:pPr>
-      <w:r>
-        <w:t xml:space="preserve">Bunn, S. E., Thoms, M. C., Hamilton, S. K., &amp; Capon, S. J. (2006). Flow variability in dryland rivers: boom, bust and the bits in between.</w:t>
-      </w:r>
-      <w:r>
-        <w:t xml:space="preserve"> </w:t>
-      </w:r>
-      <w:r>
-        <w:rPr>
-          <w:i/>
-          <w:iCs/>
-        </w:rPr>
-        <w:t xml:space="preserve">River Research and Applications</w:t>
-      </w:r>
-      <w:r>
-        <w:t xml:space="preserve">,</w:t>
-      </w:r>
-      <w:r>
-        <w:t xml:space="preserve"> </w:t>
-      </w:r>
-      <w:r>
-        <w:rPr>
-          <w:i/>
-          <w:iCs/>
-        </w:rPr>
-        <w:t xml:space="preserve">22</w:t>
-      </w:r>
-      <w:r>
-        <w:t xml:space="preserve">(2), 179–186.</w:t>
-      </w:r>
-      <w:r>
-        <w:t xml:space="preserve"> </w:t>
-      </w:r>
-      <w:hyperlink r:id="rId45">
-        <w:r>
-          <w:rPr>
-            <w:rStyle w:val="Hyperlink"/>
-          </w:rPr>
-          <w:t xml:space="preserve">https://doi.org/10.1002/rra.904</w:t>
-        </w:r>
-      </w:hyperlink>
-    </w:p>
-    <w:bookmarkEnd w:id="46"/>
-    <w:bookmarkStart w:id="48" w:name="ref-RN2830"/>
-    <w:p>
-      <w:pPr>
-        <w:pStyle w:val="Bibliografia"/>
-      </w:pPr>
-      <w:r>
-        <w:t xml:space="preserve">Carvalho, L. K., Farias, R. L., &amp; Medeiros, E. S. F. (2013a). Benthic invertebrates and the habitat structure in an intermittent river of the semi-arid region of brazil [Journal Article].</w:t>
+        <w:t xml:space="preserve">Carvalho, L. K., Farias, R. L., &amp; Medeiros, E. S. F. (2013). Macroinvertebrados bentônicos e a estrutura do habitat em um rio intermitente do semiárido brasileiro.</w:t>
       </w:r>
       <w:r>
         <w:t xml:space="preserve"> </w:t>
@@ -2153,7 +2360,7 @@
       <w:r>
         <w:t xml:space="preserve"> </w:t>
       </w:r>
-      <w:hyperlink r:id="rId47">
+      <w:hyperlink r:id="rId32">
         <w:r>
           <w:rPr>
             <w:rStyle w:val="Hyperlink"/>
@@ -2162,431 +2369,8 @@
         </w:r>
       </w:hyperlink>
     </w:p>
-    <w:bookmarkEnd w:id="48"/>
-    <w:bookmarkStart w:id="49" w:name="ref-carvalho2013"/>
-    <w:p>
-      <w:pPr>
-        <w:pStyle w:val="Bibliografia"/>
-      </w:pPr>
-      <w:r>
-        <w:t xml:space="preserve">Carvalho, L. K., Farias, R. L., &amp; Medeiros, E. S. F. (2013b). Macroinvertebrados bentônicos e a estrutura do habitat em um rio intermitente do semiárido brasileiro.</w:t>
-      </w:r>
-      <w:r>
-        <w:t xml:space="preserve"> </w:t>
-      </w:r>
-      <w:r>
-        <w:rPr>
-          <w:i/>
-          <w:iCs/>
-        </w:rPr>
-        <w:t xml:space="preserve">Neotropical Biology and Conservation</w:t>
-      </w:r>
-      <w:r>
-        <w:t xml:space="preserve">,</w:t>
-      </w:r>
-      <w:r>
-        <w:t xml:space="preserve"> </w:t>
-      </w:r>
-      <w:r>
-        <w:rPr>
-          <w:i/>
-          <w:iCs/>
-        </w:rPr>
-        <w:t xml:space="preserve">8</w:t>
-      </w:r>
-      <w:r>
-        <w:t xml:space="preserve">(2), 57–67.</w:t>
-      </w:r>
-      <w:r>
-        <w:t xml:space="preserve"> </w:t>
-      </w:r>
-      <w:hyperlink r:id="rId47">
-        <w:r>
-          <w:rPr>
-            <w:rStyle w:val="Hyperlink"/>
-          </w:rPr>
-          <w:t xml:space="preserve">https://doi.org/10.4013/nbc.2013.82.01</w:t>
-        </w:r>
-      </w:hyperlink>
-    </w:p>
-    <w:bookmarkEnd w:id="49"/>
-    <w:bookmarkStart w:id="51" w:name="ref-castro2026"/>
-    <w:p>
-      <w:pPr>
-        <w:pStyle w:val="Bibliografia"/>
-      </w:pPr>
-      <w:r>
-        <w:t xml:space="preserve">Castro, D. M. P., Santos, G. M., Macedo, D. R., Tourinho, T. C. O., Manzano, F. V., Hughes, R. M., &amp; Callisto, M. (2026). Anthropogenic pressures reduce aquatic macroinvertebrate diversity through decreased physical habitat heterogeneity.</w:t>
-      </w:r>
-      <w:r>
-        <w:t xml:space="preserve"> </w:t>
-      </w:r>
-      <w:r>
-        <w:rPr>
-          <w:i/>
-          <w:iCs/>
-        </w:rPr>
-        <w:t xml:space="preserve">Water Biology and Security</w:t>
-      </w:r>
-      <w:r>
-        <w:t xml:space="preserve">,</w:t>
-      </w:r>
-      <w:r>
-        <w:t xml:space="preserve"> </w:t>
-      </w:r>
-      <w:r>
-        <w:rPr>
-          <w:i/>
-          <w:iCs/>
-        </w:rPr>
-        <w:t xml:space="preserve">5</w:t>
-      </w:r>
-      <w:r>
-        <w:t xml:space="preserve">(3), 100496.</w:t>
-      </w:r>
-      <w:r>
-        <w:t xml:space="preserve"> </w:t>
-      </w:r>
-      <w:hyperlink r:id="rId50">
-        <w:r>
-          <w:rPr>
-            <w:rStyle w:val="Hyperlink"/>
-          </w:rPr>
-          <w:t xml:space="preserve">https://doi.org/10.1016/j.watbs.2025.100496</w:t>
-        </w:r>
-      </w:hyperlink>
-    </w:p>
-    <w:bookmarkEnd w:id="51"/>
-    <w:bookmarkStart w:id="53" w:name="ref-RN3026"/>
-    <w:p>
-      <w:pPr>
-        <w:pStyle w:val="Bibliografia"/>
-      </w:pPr>
-      <w:r>
-        <w:t xml:space="preserve">Chytrý, M., Tichý, L., Holt, J., &amp; Botta-Dukát, Z. (2002). Determination of diagnostic species with statistical fidelity measures [Journal Article].</w:t>
-      </w:r>
-      <w:r>
-        <w:t xml:space="preserve"> </w:t>
-      </w:r>
-      <w:r>
-        <w:rPr>
-          <w:i/>
-          <w:iCs/>
-        </w:rPr>
-        <w:t xml:space="preserve">Journal of Vegetation Science</w:t>
-      </w:r>
-      <w:r>
-        <w:t xml:space="preserve">,</w:t>
-      </w:r>
-      <w:r>
-        <w:t xml:space="preserve"> </w:t>
-      </w:r>
-      <w:r>
-        <w:rPr>
-          <w:i/>
-          <w:iCs/>
-        </w:rPr>
-        <w:t xml:space="preserve">13</w:t>
-      </w:r>
-      <w:r>
-        <w:t xml:space="preserve">, 79–90.</w:t>
-      </w:r>
-      <w:r>
-        <w:t xml:space="preserve"> </w:t>
-      </w:r>
-      <w:hyperlink r:id="rId52">
-        <w:r>
-          <w:rPr>
-            <w:rStyle w:val="Hyperlink"/>
-          </w:rPr>
-          <w:t xml:space="preserve">https://doi.org/10.1111/j.1654-1103.2002.tb02025.x</w:t>
-        </w:r>
-      </w:hyperlink>
-    </w:p>
-    <w:bookmarkEnd w:id="53"/>
-    <w:bookmarkStart w:id="55" w:name="ref-cobb1992"/>
-    <w:p>
-      <w:pPr>
-        <w:pStyle w:val="Bibliografia"/>
-      </w:pPr>
-      <w:r>
-        <w:t xml:space="preserve">Cobb, D. G., Galloway, T. D., &amp; Flannagan, J. F. (1992a). Effects of discharge and substrate stability on density and species composition of stream insects.</w:t>
-      </w:r>
-      <w:r>
-        <w:t xml:space="preserve"> </w:t>
-      </w:r>
-      <w:r>
-        <w:rPr>
-          <w:i/>
-          <w:iCs/>
-        </w:rPr>
-        <w:t xml:space="preserve">Canadian Journal of Fisheries and Aquatic Sciences</w:t>
-      </w:r>
-      <w:r>
-        <w:t xml:space="preserve">,</w:t>
-      </w:r>
-      <w:r>
-        <w:t xml:space="preserve"> </w:t>
-      </w:r>
-      <w:r>
-        <w:rPr>
-          <w:i/>
-          <w:iCs/>
-        </w:rPr>
-        <w:t xml:space="preserve">49</w:t>
-      </w:r>
-      <w:r>
-        <w:t xml:space="preserve">(9), 1788–1795.</w:t>
-      </w:r>
-      <w:r>
-        <w:t xml:space="preserve"> </w:t>
-      </w:r>
-      <w:hyperlink r:id="rId54">
-        <w:r>
-          <w:rPr>
-            <w:rStyle w:val="Hyperlink"/>
-          </w:rPr>
-          <w:t xml:space="preserve">https://doi.org/10.1139/f92-198</w:t>
-        </w:r>
-      </w:hyperlink>
-    </w:p>
-    <w:bookmarkEnd w:id="55"/>
-    <w:bookmarkStart w:id="56" w:name="ref-cobb1992a"/>
-    <w:p>
-      <w:pPr>
-        <w:pStyle w:val="Bibliografia"/>
-      </w:pPr>
-      <w:r>
-        <w:t xml:space="preserve">Cobb, D. G., Galloway, T. D., &amp; Flannagan, J. F. (1992b). Effects of discharge and substrate stability on density and species composition of stream insects.</w:t>
-      </w:r>
-      <w:r>
-        <w:t xml:space="preserve"> </w:t>
-      </w:r>
-      <w:r>
-        <w:rPr>
-          <w:i/>
-          <w:iCs/>
-        </w:rPr>
-        <w:t xml:space="preserve">Canadian Journal of Fisheries and Aquatic Sciences</w:t>
-      </w:r>
-      <w:r>
-        <w:t xml:space="preserve">,</w:t>
-      </w:r>
-      <w:r>
-        <w:t xml:space="preserve"> </w:t>
-      </w:r>
-      <w:r>
-        <w:rPr>
-          <w:i/>
-          <w:iCs/>
-        </w:rPr>
-        <w:t xml:space="preserve">49</w:t>
-      </w:r>
-      <w:r>
-        <w:t xml:space="preserve">(9), 1788–1795.</w:t>
-      </w:r>
-      <w:r>
-        <w:t xml:space="preserve"> </w:t>
-      </w:r>
-      <w:hyperlink r:id="rId54">
-        <w:r>
-          <w:rPr>
-            <w:rStyle w:val="Hyperlink"/>
-          </w:rPr>
-          <w:t xml:space="preserve">https://doi.org/10.1139/f92-198</w:t>
-        </w:r>
-      </w:hyperlink>
-    </w:p>
-    <w:bookmarkEnd w:id="56"/>
-    <w:bookmarkStart w:id="58" w:name="ref-RN3028"/>
-    <w:p>
-      <w:pPr>
-        <w:pStyle w:val="Bibliografia"/>
-      </w:pPr>
-      <w:r>
-        <w:t xml:space="preserve">De Cáceres, M., &amp; Legendre, P. (2009). Associations between species and groups of sites: Indices and statistical inference [Journal Article].</w:t>
-      </w:r>
-      <w:r>
-        <w:t xml:space="preserve"> </w:t>
-      </w:r>
-      <w:r>
-        <w:rPr>
-          <w:i/>
-          <w:iCs/>
-        </w:rPr>
-        <w:t xml:space="preserve">Ecology</w:t>
-      </w:r>
-      <w:r>
-        <w:t xml:space="preserve">,</w:t>
-      </w:r>
-      <w:r>
-        <w:t xml:space="preserve"> </w:t>
-      </w:r>
-      <w:r>
-        <w:rPr>
-          <w:i/>
-          <w:iCs/>
-        </w:rPr>
-        <w:t xml:space="preserve">90</w:t>
-      </w:r>
-      <w:r>
-        <w:t xml:space="preserve">(12), 3566–3574.</w:t>
-      </w:r>
-      <w:r>
-        <w:t xml:space="preserve"> </w:t>
-      </w:r>
-      <w:hyperlink r:id="rId57">
-        <w:r>
-          <w:rPr>
-            <w:rStyle w:val="Hyperlink"/>
-          </w:rPr>
-          <w:t xml:space="preserve">https://doi.org/10.1890/08-1823.1</w:t>
-        </w:r>
-      </w:hyperlink>
-    </w:p>
-    <w:bookmarkEnd w:id="58"/>
-    <w:bookmarkStart w:id="60" w:name="ref-RN3027"/>
-    <w:p>
-      <w:pPr>
-        <w:pStyle w:val="Bibliografia"/>
-      </w:pPr>
-      <w:r>
-        <w:t xml:space="preserve">De Cáceres, M., Legendre, P., &amp; Moretti, M. (2010). Improving indicator species analysis by combining groups of sites [Journal Article].</w:t>
-      </w:r>
-      <w:r>
-        <w:t xml:space="preserve"> </w:t>
-      </w:r>
-      <w:r>
-        <w:rPr>
-          <w:i/>
-          <w:iCs/>
-        </w:rPr>
-        <w:t xml:space="preserve">Oikos</w:t>
-      </w:r>
-      <w:r>
-        <w:t xml:space="preserve">,</w:t>
-      </w:r>
-      <w:r>
-        <w:t xml:space="preserve"> </w:t>
-      </w:r>
-      <w:r>
-        <w:rPr>
-          <w:i/>
-          <w:iCs/>
-        </w:rPr>
-        <w:t xml:space="preserve">119</w:t>
-      </w:r>
-      <w:r>
-        <w:t xml:space="preserve">, 1674–1684.</w:t>
-      </w:r>
-      <w:r>
-        <w:t xml:space="preserve"> </w:t>
-      </w:r>
-      <w:hyperlink r:id="rId59">
-        <w:r>
-          <w:rPr>
-            <w:rStyle w:val="Hyperlink"/>
-          </w:rPr>
-          <w:t xml:space="preserve">https://doi.org/10.1111/j.1600-0706.2010.18334.x</w:t>
-        </w:r>
-      </w:hyperlink>
-    </w:p>
-    <w:bookmarkEnd w:id="60"/>
-    <w:bookmarkStart w:id="61" w:name="ref-deliraazevêdo2017"/>
-    <w:p>
-      <w:pPr>
-        <w:pStyle w:val="Bibliografia"/>
-      </w:pPr>
-      <w:r>
-        <w:t xml:space="preserve">De Lira Azevêdo, E., De Lucena Barbosa, J. E., Viana, L. G., Anacleto, M. J. P., Callisto, M., &amp; Molozzi, J. (2017). Application of a statistical model for the assessment of environmental quality in neotropical semi-arid reservoirs.</w:t>
-      </w:r>
-      <w:r>
-        <w:t xml:space="preserve"> </w:t>
-      </w:r>
-      <w:r>
-        <w:rPr>
-          <w:i/>
-          <w:iCs/>
-        </w:rPr>
-        <w:t xml:space="preserve">Environmental Monitoring and Assessment</w:t>
-      </w:r>
-      <w:r>
-        <w:t xml:space="preserve">,</w:t>
-      </w:r>
-      <w:r>
-        <w:t xml:space="preserve"> </w:t>
-      </w:r>
-      <w:r>
-        <w:rPr>
-          <w:i/>
-          <w:iCs/>
-        </w:rPr>
-        <w:t xml:space="preserve">189</w:t>
-      </w:r>
-      <w:r>
-        <w:t xml:space="preserve">(2), 65.</w:t>
-      </w:r>
-      <w:r>
-        <w:t xml:space="preserve"> </w:t>
-      </w:r>
-      <w:hyperlink r:id="rId32">
-        <w:r>
-          <w:rPr>
-            <w:rStyle w:val="Hyperlink"/>
-          </w:rPr>
-          <w:t xml:space="preserve">https://doi.org/10.1007/s10661-016-5723-3</w:t>
-        </w:r>
-      </w:hyperlink>
-    </w:p>
-    <w:bookmarkEnd w:id="61"/>
-    <w:bookmarkStart w:id="63" w:name="ref-RN2094"/>
-    <w:p>
-      <w:pPr>
-        <w:pStyle w:val="Bibliografia"/>
-      </w:pPr>
-      <w:r>
-        <w:t xml:space="preserve">Dufrene, M., &amp; Legendre, P. (1997). Species assemblages and indicator species: The need for a flexible asymmetrical approach [Journal Article].</w:t>
-      </w:r>
-      <w:r>
-        <w:t xml:space="preserve"> </w:t>
-      </w:r>
-      <w:r>
-        <w:rPr>
-          <w:i/>
-          <w:iCs/>
-        </w:rPr>
-        <w:t xml:space="preserve">Ecological Monographs</w:t>
-      </w:r>
-      <w:r>
-        <w:t xml:space="preserve">,</w:t>
-      </w:r>
-      <w:r>
-        <w:t xml:space="preserve"> </w:t>
-      </w:r>
-      <w:r>
-        <w:rPr>
-          <w:i/>
-          <w:iCs/>
-        </w:rPr>
-        <w:t xml:space="preserve">67</w:t>
-      </w:r>
-      <w:r>
-        <w:t xml:space="preserve">(3), 345–366.</w:t>
-      </w:r>
-      <w:r>
-        <w:t xml:space="preserve"> </w:t>
-      </w:r>
-      <w:hyperlink r:id="rId62">
-        <w:r>
-          <w:rPr>
-            <w:rStyle w:val="Hyperlink"/>
-          </w:rPr>
-          <w:t xml:space="preserve">https://doi.org/10.1890/0012-9615(1997)067[0345:SAAIST]2.0.CO;2</w:t>
-        </w:r>
-      </w:hyperlink>
-    </w:p>
-    <w:bookmarkEnd w:id="63"/>
-    <w:bookmarkStart w:id="65" w:name="ref-farias2020"/>
+    <w:bookmarkEnd w:id="33"/>
+    <w:bookmarkStart w:id="35" w:name="ref-farias2020"/>
     <w:p>
       <w:pPr>
         <w:pStyle w:val="Bibliografia"/>
@@ -2623,7 +2407,7 @@
       <w:r>
         <w:t xml:space="preserve"> </w:t>
       </w:r>
-      <w:hyperlink r:id="rId64">
+      <w:hyperlink r:id="rId34">
         <w:r>
           <w:rPr>
             <w:rStyle w:val="Hyperlink"/>
@@ -2632,14 +2416,14 @@
         </w:r>
       </w:hyperlink>
     </w:p>
-    <w:bookmarkEnd w:id="65"/>
-    <w:bookmarkStart w:id="67" w:name="ref-RN2695"/>
+    <w:bookmarkEnd w:id="35"/>
+    <w:bookmarkStart w:id="37" w:name="ref-farias2012"/>
     <w:p>
       <w:pPr>
         <w:pStyle w:val="Bibliografia"/>
       </w:pPr>
       <w:r>
-        <w:t xml:space="preserve">Farias, R. L., Carvalho, L. K., &amp; Medeiros, E. S. F. (2012). Distribution of chironomidae in a semiarid intermittent river of brazil [Journal Article].</w:t>
+        <w:t xml:space="preserve">Farias, R. L., Carvalho, L. K., &amp; Medeiros, E. S. F. (2012). Distribution of Chironomidae in a Semiarid Intermittent River of Brazil.</w:t>
       </w:r>
       <w:r>
         <w:t xml:space="preserve"> </w:t>
@@ -2665,12 +2449,12 @@
         <w:t xml:space="preserve">41</w:t>
       </w:r>
       <w:r>
-        <w:t xml:space="preserve">, 450–460.</w:t>
+        <w:t xml:space="preserve">(6), 450–460.</w:t>
       </w:r>
       <w:r>
         <w:t xml:space="preserve"> </w:t>
       </w:r>
-      <w:hyperlink r:id="rId66">
+      <w:hyperlink r:id="rId36">
         <w:r>
           <w:rPr>
             <w:rStyle w:val="Hyperlink"/>
@@ -2679,1321 +2463,10 @@
         </w:r>
       </w:hyperlink>
     </w:p>
-    <w:bookmarkEnd w:id="67"/>
-    <w:bookmarkStart w:id="68" w:name="ref-RN2905"/>
-    <w:p>
-      <w:pPr>
-        <w:pStyle w:val="Bibliografia"/>
-      </w:pPr>
-      <w:r>
-        <w:t xml:space="preserve">Farias, R. L., Stenert, C., Maltchik, L., &amp; Medeiros, E. S. F. (2020). Partitioning of macroinvertebrate assemblages across temporary pools in an intermittent dryland river [Journal Article].</w:t>
-      </w:r>
-      <w:r>
-        <w:t xml:space="preserve"> </w:t>
-      </w:r>
-      <w:r>
-        <w:rPr>
-          <w:i/>
-          <w:iCs/>
-        </w:rPr>
-        <w:t xml:space="preserve">Inland Waters</w:t>
-      </w:r>
-      <w:r>
-        <w:t xml:space="preserve">,</w:t>
-      </w:r>
-      <w:r>
-        <w:t xml:space="preserve"> </w:t>
-      </w:r>
-      <w:r>
-        <w:rPr>
-          <w:i/>
-          <w:iCs/>
-        </w:rPr>
-        <w:t xml:space="preserve">10</w:t>
-      </w:r>
-      <w:r>
-        <w:t xml:space="preserve">(4), 480–492.</w:t>
-      </w:r>
-      <w:r>
-        <w:t xml:space="preserve"> </w:t>
-      </w:r>
-      <w:hyperlink r:id="rId64">
-        <w:r>
-          <w:rPr>
-            <w:rStyle w:val="Hyperlink"/>
-          </w:rPr>
-          <w:t xml:space="preserve">https://doi.org/10.1080/20442041.2020.1738841</w:t>
-        </w:r>
-      </w:hyperlink>
-    </w:p>
-    <w:bookmarkEnd w:id="68"/>
-    <w:bookmarkStart w:id="70" w:name="ref-RN361"/>
-    <w:p>
-      <w:pPr>
-        <w:pStyle w:val="Bibliografia"/>
-      </w:pPr>
-      <w:r>
-        <w:t xml:space="preserve">Lanés, L. E. K., Reichard, M., Moura, R. G. de, Godoy, R. S., &amp; Maltchik, L. (2018). Environmental predictors for annual fish assemblages in subtropical grasslands of south america: The role of landscape and habitat characteristics [Journal Article].</w:t>
-      </w:r>
-      <w:r>
-        <w:t xml:space="preserve"> </w:t>
-      </w:r>
-      <w:r>
-        <w:rPr>
-          <w:i/>
-          <w:iCs/>
-        </w:rPr>
-        <w:t xml:space="preserve">Environmental Biology of Fishes</w:t>
-      </w:r>
-      <w:r>
-        <w:t xml:space="preserve">,</w:t>
-      </w:r>
-      <w:r>
-        <w:t xml:space="preserve"> </w:t>
-      </w:r>
-      <w:r>
-        <w:rPr>
-          <w:i/>
-          <w:iCs/>
-        </w:rPr>
-        <w:t xml:space="preserve">101</w:t>
-      </w:r>
-      <w:r>
-        <w:t xml:space="preserve">, 963–977.</w:t>
-      </w:r>
-      <w:r>
-        <w:t xml:space="preserve"> </w:t>
-      </w:r>
-      <w:hyperlink r:id="rId69">
-        <w:r>
-          <w:rPr>
-            <w:rStyle w:val="Hyperlink"/>
-          </w:rPr>
-          <w:t xml:space="preserve">https://doi.org/10.1007/s10641-018-0751-1</w:t>
-        </w:r>
-      </w:hyperlink>
-    </w:p>
-    <w:bookmarkEnd w:id="70"/>
-    <w:bookmarkStart w:id="71" w:name="ref-RN1482"/>
-    <w:p>
-      <w:pPr>
-        <w:pStyle w:val="Bibliografia"/>
-      </w:pPr>
-      <w:r>
-        <w:t xml:space="preserve">Lê, S., Josse, J., &amp; Husson, F. (2008). FactoMineR: An r package for multivariate analysis [Journal Article].</w:t>
-      </w:r>
-      <w:r>
-        <w:t xml:space="preserve"> </w:t>
-      </w:r>
-      <w:r>
-        <w:rPr>
-          <w:i/>
-          <w:iCs/>
-        </w:rPr>
-        <w:t xml:space="preserve">Journal of Statistical Software</w:t>
-      </w:r>
-      <w:r>
-        <w:t xml:space="preserve">,</w:t>
-      </w:r>
-      <w:r>
-        <w:t xml:space="preserve"> </w:t>
-      </w:r>
-      <w:r>
-        <w:rPr>
-          <w:i/>
-          <w:iCs/>
-        </w:rPr>
-        <w:t xml:space="preserve">25</w:t>
-      </w:r>
-      <w:r>
-        <w:t xml:space="preserve">(1), 1–18.</w:t>
-      </w:r>
-    </w:p>
-    <w:bookmarkEnd w:id="71"/>
-    <w:bookmarkStart w:id="73" w:name="ref-RN2969"/>
-    <w:p>
-      <w:pPr>
-        <w:pStyle w:val="Bibliografia"/>
-      </w:pPr>
-      <w:r>
-        <w:t xml:space="preserve">Legendre, P., &amp; Anderson, M. J. (1999). Distance-based redundancy analysis: Testing multispecies responses in multifactorial ecological experiments [Journal Article].</w:t>
-      </w:r>
-      <w:r>
-        <w:t xml:space="preserve"> </w:t>
-      </w:r>
-      <w:r>
-        <w:rPr>
-          <w:i/>
-          <w:iCs/>
-        </w:rPr>
-        <w:t xml:space="preserve">Ecological Monographs</w:t>
-      </w:r>
-      <w:r>
-        <w:t xml:space="preserve">,</w:t>
-      </w:r>
-      <w:r>
-        <w:t xml:space="preserve"> </w:t>
-      </w:r>
-      <w:r>
-        <w:rPr>
-          <w:i/>
-          <w:iCs/>
-        </w:rPr>
-        <w:t xml:space="preserve">69</w:t>
-      </w:r>
-      <w:r>
-        <w:t xml:space="preserve">(1), 1–24.</w:t>
-      </w:r>
-      <w:r>
-        <w:t xml:space="preserve"> </w:t>
-      </w:r>
-      <w:hyperlink r:id="rId72">
-        <w:r>
-          <w:rPr>
-            <w:rStyle w:val="Hyperlink"/>
-          </w:rPr>
-          <w:t xml:space="preserve">https://doi.org/10.1890/0012-9615(1999)069[0001:dbratm]2.0.co;2</w:t>
-        </w:r>
-      </w:hyperlink>
-    </w:p>
-    <w:bookmarkEnd w:id="73"/>
-    <w:bookmarkStart w:id="75" w:name="ref-RN2904"/>
-    <w:p>
-      <w:pPr>
-        <w:pStyle w:val="Bibliografia"/>
-      </w:pPr>
-      <w:r>
-        <w:t xml:space="preserve">Legendre, P., &amp; Gallagher, E. D. (2001). Ecologically meaningful transformations for ordination of species data [Journal Article].</w:t>
-      </w:r>
-      <w:r>
-        <w:t xml:space="preserve"> </w:t>
-      </w:r>
-      <w:r>
-        <w:rPr>
-          <w:i/>
-          <w:iCs/>
-        </w:rPr>
-        <w:t xml:space="preserve">Oecologia</w:t>
-      </w:r>
-      <w:r>
-        <w:t xml:space="preserve">,</w:t>
-      </w:r>
-      <w:r>
-        <w:t xml:space="preserve"> </w:t>
-      </w:r>
-      <w:r>
-        <w:rPr>
-          <w:i/>
-          <w:iCs/>
-        </w:rPr>
-        <w:t xml:space="preserve">129</w:t>
-      </w:r>
-      <w:r>
-        <w:t xml:space="preserve">, 271–280.</w:t>
-      </w:r>
-      <w:r>
-        <w:t xml:space="preserve"> </w:t>
-      </w:r>
-      <w:hyperlink r:id="rId74">
-        <w:r>
-          <w:rPr>
-            <w:rStyle w:val="Hyperlink"/>
-          </w:rPr>
-          <w:t xml:space="preserve">https://doi.org/10.1007/s004420100716</w:t>
-        </w:r>
-      </w:hyperlink>
-    </w:p>
-    <w:bookmarkEnd w:id="75"/>
-    <w:bookmarkStart w:id="77" w:name="ref-RN1940"/>
-    <w:p>
-      <w:pPr>
-        <w:pStyle w:val="Bibliografia"/>
-      </w:pPr>
-      <w:r>
-        <w:t xml:space="preserve">Maitland, P. S. (1990). Field studies: Sampling in freshwaters [Book Section]. In</w:t>
-      </w:r>
-      <w:r>
-        <w:t xml:space="preserve"> </w:t>
-      </w:r>
-      <w:r>
-        <w:rPr>
-          <w:i/>
-          <w:iCs/>
-        </w:rPr>
-        <w:t xml:space="preserve">Biology of fresh waters</w:t>
-      </w:r>
-      <w:r>
-        <w:t xml:space="preserve"> </w:t>
-      </w:r>
-      <w:r>
-        <w:t xml:space="preserve">(2nd ed., pp. 123–148). Springer.</w:t>
-      </w:r>
-      <w:r>
-        <w:t xml:space="preserve"> </w:t>
-      </w:r>
-      <w:hyperlink r:id="rId76">
-        <w:r>
-          <w:rPr>
-            <w:rStyle w:val="Hyperlink"/>
-          </w:rPr>
-          <w:t xml:space="preserve">https://doi.org/10.1007/978-94-011-7852-5_5</w:t>
-        </w:r>
-      </w:hyperlink>
-    </w:p>
-    <w:bookmarkEnd w:id="77"/>
-    <w:bookmarkStart w:id="79" w:name="ref-RN2627"/>
-    <w:p>
-      <w:pPr>
-        <w:pStyle w:val="Bibliografia"/>
-      </w:pPr>
-      <w:r>
-        <w:t xml:space="preserve">Maltchik, L., Lanés, L. E. K., Stenert, C., &amp; Medeiros, E. S. F. (2010). Species-area relationship and environmental predictors of fish communities in coastal freshwater wetlands of southern brazil [Journal Article].</w:t>
-      </w:r>
-      <w:r>
-        <w:t xml:space="preserve"> </w:t>
-      </w:r>
-      <w:r>
-        <w:rPr>
-          <w:i/>
-          <w:iCs/>
-        </w:rPr>
-        <w:t xml:space="preserve">Environmental Biology of Fishes</w:t>
-      </w:r>
-      <w:r>
-        <w:t xml:space="preserve">,</w:t>
-      </w:r>
-      <w:r>
-        <w:t xml:space="preserve"> </w:t>
-      </w:r>
-      <w:r>
-        <w:rPr>
-          <w:i/>
-          <w:iCs/>
-        </w:rPr>
-        <w:t xml:space="preserve">88</w:t>
-      </w:r>
-      <w:r>
-        <w:t xml:space="preserve">(1), 25–35.</w:t>
-      </w:r>
-      <w:r>
-        <w:t xml:space="preserve"> </w:t>
-      </w:r>
-      <w:hyperlink r:id="rId78">
-        <w:r>
-          <w:rPr>
-            <w:rStyle w:val="Hyperlink"/>
-          </w:rPr>
-          <w:t xml:space="preserve">https://doi.org/10.1007/s10641-010-9614-0</w:t>
-        </w:r>
-      </w:hyperlink>
-    </w:p>
-    <w:bookmarkEnd w:id="79"/>
-    <w:bookmarkStart w:id="81" w:name="ref-RN2442"/>
-    <w:p>
-      <w:pPr>
-        <w:pStyle w:val="Bibliografia"/>
-      </w:pPr>
-      <w:r>
-        <w:t xml:space="preserve">Maltchik, L., &amp; Medeiros, E. S. F. (2006). Conservation importance of semi-arid streams in north-eastern brazil: Implications of hydrological disturbance and species diversity [Journal Article].</w:t>
-      </w:r>
-      <w:r>
-        <w:t xml:space="preserve"> </w:t>
-      </w:r>
-      <w:r>
-        <w:rPr>
-          <w:i/>
-          <w:iCs/>
-        </w:rPr>
-        <w:t xml:space="preserve">Aquatic Conservation: Marine and Freshwater Ecosystems</w:t>
-      </w:r>
-      <w:r>
-        <w:t xml:space="preserve">,</w:t>
-      </w:r>
-      <w:r>
-        <w:t xml:space="preserve"> </w:t>
-      </w:r>
-      <w:r>
-        <w:rPr>
-          <w:i/>
-          <w:iCs/>
-        </w:rPr>
-        <w:t xml:space="preserve">16</w:t>
-      </w:r>
-      <w:r>
-        <w:t xml:space="preserve">(7), 665–677.</w:t>
-      </w:r>
-      <w:r>
-        <w:t xml:space="preserve"> </w:t>
-      </w:r>
-      <w:hyperlink r:id="rId80">
-        <w:r>
-          <w:rPr>
-            <w:rStyle w:val="Hyperlink"/>
-          </w:rPr>
-          <w:t xml:space="preserve">https://doi.org/10.1002/aqc.805</w:t>
-        </w:r>
-      </w:hyperlink>
-    </w:p>
-    <w:bookmarkEnd w:id="81"/>
-    <w:bookmarkStart w:id="82" w:name="ref-RN372"/>
-    <w:p>
-      <w:pPr>
-        <w:pStyle w:val="Bibliografia"/>
-      </w:pPr>
-      <w:r>
-        <w:t xml:space="preserve">McCafferty, W. P., &amp; Provonsha, A. V. (1983).</w:t>
-      </w:r>
-      <w:r>
-        <w:t xml:space="preserve"> </w:t>
-      </w:r>
-      <w:r>
-        <w:rPr>
-          <w:i/>
-          <w:iCs/>
-        </w:rPr>
-        <w:t xml:space="preserve">Aquatic entomology: The fisherman’s and ecologist’s illustrated guide to insects and their relatives</w:t>
-      </w:r>
-      <w:r>
-        <w:t xml:space="preserve"> </w:t>
-      </w:r>
-      <w:r>
-        <w:t xml:space="preserve">(p. 448) [Book]. Jones; Bartlett Publishers, Inc.</w:t>
-      </w:r>
-    </w:p>
-    <w:bookmarkEnd w:id="82"/>
-    <w:bookmarkStart w:id="83" w:name="ref-RN1552"/>
-    <w:p>
-      <w:pPr>
-        <w:pStyle w:val="Bibliografia"/>
-      </w:pPr>
-      <w:r>
-        <w:t xml:space="preserve">McCune, B., &amp; Grace, J. B. (2002).</w:t>
-      </w:r>
-      <w:r>
-        <w:t xml:space="preserve"> </w:t>
-      </w:r>
-      <w:r>
-        <w:rPr>
-          <w:i/>
-          <w:iCs/>
-        </w:rPr>
-        <w:t xml:space="preserve">Analysis of ecological communities</w:t>
-      </w:r>
-      <w:r>
-        <w:t xml:space="preserve"> </w:t>
-      </w:r>
-      <w:r>
-        <w:t xml:space="preserve">(p. 300) [Book]. MjM Software Design.</w:t>
-      </w:r>
-    </w:p>
-    <w:bookmarkEnd w:id="83"/>
-    <w:bookmarkStart w:id="85" w:name="ref-RN2692"/>
-    <w:p>
-      <w:pPr>
-        <w:pStyle w:val="Bibliografia"/>
-      </w:pPr>
-      <w:r>
-        <w:t xml:space="preserve">Medeiros, E. S. F., Noia, N. P., Antunes, L. C., &amp; Melo, T. X. (2011). Zooplankton composition in aquatic systems of semi-arid brazil: Spatial variation and implications of water management [Journal Article].</w:t>
-      </w:r>
-      <w:r>
-        <w:t xml:space="preserve"> </w:t>
-      </w:r>
-      <w:r>
-        <w:rPr>
-          <w:i/>
-          <w:iCs/>
-        </w:rPr>
-        <w:t xml:space="preserve">Pan-American Journal of Aquatic Sciences</w:t>
-      </w:r>
-      <w:r>
-        <w:t xml:space="preserve">,</w:t>
-      </w:r>
-      <w:r>
-        <w:t xml:space="preserve"> </w:t>
-      </w:r>
-      <w:r>
-        <w:rPr>
-          <w:i/>
-          <w:iCs/>
-        </w:rPr>
-        <w:t xml:space="preserve">6</w:t>
-      </w:r>
-      <w:r>
-        <w:t xml:space="preserve">(4), 290–302.</w:t>
-      </w:r>
-      <w:r>
-        <w:t xml:space="preserve"> </w:t>
-      </w:r>
-      <w:hyperlink r:id="rId84">
-        <w:r>
-          <w:rPr>
-            <w:rStyle w:val="Hyperlink"/>
-          </w:rPr>
-          <w:t xml:space="preserve">https://panamjas.org/artigos.php?id_publi=190</w:t>
-        </w:r>
-      </w:hyperlink>
-    </w:p>
-    <w:bookmarkEnd w:id="85"/>
-    <w:bookmarkStart w:id="87" w:name="ref-RN1965"/>
-    <w:p>
-      <w:pPr>
-        <w:pStyle w:val="Bibliografia"/>
-      </w:pPr>
-      <w:r>
-        <w:t xml:space="preserve">Medeiros, E. S. F., Silva, M. J. da, Ramos, T. P. A., &amp; Ramos, R. T. C. (2024a). Environmental variables as predictors of fish community composition in semiarid aquatic systems [Journal Article].</w:t>
-      </w:r>
-      <w:r>
-        <w:t xml:space="preserve"> </w:t>
-      </w:r>
-      <w:r>
-        <w:rPr>
-          <w:i/>
-          <w:iCs/>
-        </w:rPr>
-        <w:t xml:space="preserve">Acta Limnologica Brasiliensia</w:t>
-      </w:r>
-      <w:r>
-        <w:t xml:space="preserve">,</w:t>
-      </w:r>
-      <w:r>
-        <w:t xml:space="preserve"> </w:t>
-      </w:r>
-      <w:r>
-        <w:rPr>
-          <w:i/>
-          <w:iCs/>
-        </w:rPr>
-        <w:t xml:space="preserve">36</w:t>
-      </w:r>
-      <w:r>
-        <w:t xml:space="preserve">(e4), 1–13.</w:t>
-      </w:r>
-      <w:r>
-        <w:t xml:space="preserve"> </w:t>
-      </w:r>
-      <w:hyperlink r:id="rId86">
-        <w:r>
-          <w:rPr>
-            <w:rStyle w:val="Hyperlink"/>
-          </w:rPr>
-          <w:t xml:space="preserve">https://doi.org/10.1590/S2179-975X3023</w:t>
-        </w:r>
-      </w:hyperlink>
-    </w:p>
-    <w:bookmarkEnd w:id="87"/>
-    <w:bookmarkStart w:id="89" w:name="ref-medeiros2024"/>
-    <w:p>
-      <w:pPr>
-        <w:pStyle w:val="Bibliografia"/>
-      </w:pPr>
-      <w:r>
-        <w:t xml:space="preserve">Medeiros, E. S. F., Silva, M. J. D., Ramos, T. P. A., &amp; Ramos, R. T. C. (2024b). Environmental variables as predictors of fish community composition in semiarid aquatic systems.</w:t>
-      </w:r>
-      <w:r>
-        <w:t xml:space="preserve"> </w:t>
-      </w:r>
-      <w:r>
-        <w:rPr>
-          <w:i/>
-          <w:iCs/>
-        </w:rPr>
-        <w:t xml:space="preserve">Acta Limnologica Brasiliensia</w:t>
-      </w:r>
-      <w:r>
-        <w:t xml:space="preserve">,</w:t>
-      </w:r>
-      <w:r>
-        <w:t xml:space="preserve"> </w:t>
-      </w:r>
-      <w:r>
-        <w:rPr>
-          <w:i/>
-          <w:iCs/>
-        </w:rPr>
-        <w:t xml:space="preserve">36</w:t>
-      </w:r>
-      <w:r>
-        <w:t xml:space="preserve">, e4.</w:t>
-      </w:r>
-      <w:r>
-        <w:t xml:space="preserve"> </w:t>
-      </w:r>
-      <w:hyperlink r:id="rId88">
-        <w:r>
-          <w:rPr>
-            <w:rStyle w:val="Hyperlink"/>
-          </w:rPr>
-          <w:t xml:space="preserve">https://doi.org/10.1590/s2179-975x3023</w:t>
-        </w:r>
-      </w:hyperlink>
-    </w:p>
-    <w:bookmarkEnd w:id="89"/>
-    <w:bookmarkStart w:id="90" w:name="ref-medeiros2024a"/>
-    <w:p>
-      <w:pPr>
-        <w:pStyle w:val="Bibliografia"/>
-      </w:pPr>
-      <w:r>
-        <w:t xml:space="preserve">Medeiros, E. S. F., Silva, M. J. D., Ramos, T. P. A., &amp; Ramos, R. T. C. (2024c). Environmental variables as predictors of fish community composition in semiarid aquatic systems.</w:t>
-      </w:r>
-      <w:r>
-        <w:t xml:space="preserve"> </w:t>
-      </w:r>
-      <w:r>
-        <w:rPr>
-          <w:i/>
-          <w:iCs/>
-        </w:rPr>
-        <w:t xml:space="preserve">Acta Limnologica Brasiliensia</w:t>
-      </w:r>
-      <w:r>
-        <w:t xml:space="preserve">,</w:t>
-      </w:r>
-      <w:r>
-        <w:t xml:space="preserve"> </w:t>
-      </w:r>
-      <w:r>
-        <w:rPr>
-          <w:i/>
-          <w:iCs/>
-        </w:rPr>
-        <w:t xml:space="preserve">36</w:t>
-      </w:r>
-      <w:r>
-        <w:t xml:space="preserve">, e4.</w:t>
-      </w:r>
-      <w:r>
-        <w:t xml:space="preserve"> </w:t>
-      </w:r>
-      <w:hyperlink r:id="rId88">
-        <w:r>
-          <w:rPr>
-            <w:rStyle w:val="Hyperlink"/>
-          </w:rPr>
-          <w:t xml:space="preserve">https://doi.org/10.1590/s2179-975x3023</w:t>
-        </w:r>
-      </w:hyperlink>
-    </w:p>
-    <w:bookmarkEnd w:id="90"/>
-    <w:bookmarkStart w:id="92" w:name="ref-RN2491"/>
-    <w:p>
-      <w:pPr>
-        <w:pStyle w:val="Bibliografia"/>
-      </w:pPr>
-      <w:r>
-        <w:t xml:space="preserve">Medeiros, E. S. F., Silva, M. J., &amp; Ramos, R. T. C. (2008a). Application of catchment- and local-scale variables for aquatic habitat characterization and assessment in the brazilian semi-arid region [Journal Article].</w:t>
-      </w:r>
-      <w:r>
-        <w:t xml:space="preserve"> </w:t>
-      </w:r>
-      <w:r>
-        <w:rPr>
-          <w:i/>
-          <w:iCs/>
-        </w:rPr>
-        <w:t xml:space="preserve">Neotropical Biology and Conservation</w:t>
-      </w:r>
-      <w:r>
-        <w:t xml:space="preserve">,</w:t>
-      </w:r>
-      <w:r>
-        <w:t xml:space="preserve"> </w:t>
-      </w:r>
-      <w:r>
-        <w:rPr>
-          <w:i/>
-          <w:iCs/>
-        </w:rPr>
-        <w:t xml:space="preserve">3</w:t>
-      </w:r>
-      <w:r>
-        <w:t xml:space="preserve">(1), 13–20.</w:t>
-      </w:r>
-      <w:r>
-        <w:t xml:space="preserve"> </w:t>
-      </w:r>
-      <w:hyperlink r:id="rId91">
-        <w:r>
-          <w:rPr>
-            <w:rStyle w:val="Hyperlink"/>
-          </w:rPr>
-          <w:t xml:space="preserve">https://revistas.unisinos.br/index.php/neotropical/article/view/5440</w:t>
-        </w:r>
-      </w:hyperlink>
-    </w:p>
-    <w:bookmarkEnd w:id="92"/>
-    <w:bookmarkStart w:id="93" w:name="ref-medeiros2008"/>
-    <w:p>
-      <w:pPr>
-        <w:pStyle w:val="Bibliografia"/>
-      </w:pPr>
-      <w:r>
-        <w:t xml:space="preserve">Medeiros, E. S. F., Silva, M. J., &amp; Ramos, R. T. C. (2008b). Application of catchment- and local-scale variables for aquatic habitat characterization and assessment in the brazilian semi-arid region.</w:t>
-      </w:r>
-      <w:r>
-        <w:t xml:space="preserve"> </w:t>
-      </w:r>
-      <w:r>
-        <w:rPr>
-          <w:i/>
-          <w:iCs/>
-        </w:rPr>
-        <w:t xml:space="preserve">Neotropical Biology and Conservation</w:t>
-      </w:r>
-      <w:r>
-        <w:t xml:space="preserve">,</w:t>
-      </w:r>
-      <w:r>
-        <w:t xml:space="preserve"> </w:t>
-      </w:r>
-      <w:r>
-        <w:rPr>
-          <w:i/>
-          <w:iCs/>
-        </w:rPr>
-        <w:t xml:space="preserve">3</w:t>
-      </w:r>
-      <w:r>
-        <w:t xml:space="preserve">(1), 13–20.</w:t>
-      </w:r>
-      <w:r>
-        <w:t xml:space="preserve"> </w:t>
-      </w:r>
-      <w:hyperlink r:id="rId91">
-        <w:r>
-          <w:rPr>
-            <w:rStyle w:val="Hyperlink"/>
-          </w:rPr>
-          <w:t xml:space="preserve">https://revistas.unisinos.br/index.php/neotropical/article/view/5440</w:t>
-        </w:r>
-      </w:hyperlink>
-    </w:p>
-    <w:bookmarkEnd w:id="93"/>
-    <w:bookmarkStart w:id="94" w:name="ref-medeiros2008a"/>
-    <w:p>
-      <w:pPr>
-        <w:pStyle w:val="Bibliografia"/>
-      </w:pPr>
-      <w:r>
-        <w:t xml:space="preserve">Medeiros, E. S. F., Silva, M. J., &amp; Ramos, R. T. C. (2008c). Application of catchment- and local-scale variables for aquatic habitat characterization and assessment in the brazilian semi-arid region.</w:t>
-      </w:r>
-      <w:r>
-        <w:t xml:space="preserve"> </w:t>
-      </w:r>
-      <w:r>
-        <w:rPr>
-          <w:i/>
-          <w:iCs/>
-        </w:rPr>
-        <w:t xml:space="preserve">Neotropical Biology and Conservation</w:t>
-      </w:r>
-      <w:r>
-        <w:t xml:space="preserve">,</w:t>
-      </w:r>
-      <w:r>
-        <w:t xml:space="preserve"> </w:t>
-      </w:r>
-      <w:r>
-        <w:rPr>
-          <w:i/>
-          <w:iCs/>
-        </w:rPr>
-        <w:t xml:space="preserve">3</w:t>
-      </w:r>
-      <w:r>
-        <w:t xml:space="preserve">(1), 13–20.</w:t>
-      </w:r>
-      <w:r>
-        <w:t xml:space="preserve"> </w:t>
-      </w:r>
-      <w:hyperlink r:id="rId91">
-        <w:r>
-          <w:rPr>
-            <w:rStyle w:val="Hyperlink"/>
-          </w:rPr>
-          <w:t xml:space="preserve">https://revistas.unisinos.br/index.php/neotropical/article/view/5440</w:t>
-        </w:r>
-      </w:hyperlink>
-    </w:p>
-    <w:bookmarkEnd w:id="94"/>
-    <w:bookmarkStart w:id="95" w:name="ref-RN2990"/>
-    <w:p>
-      <w:pPr>
-        <w:pStyle w:val="Bibliografia"/>
-      </w:pPr>
-      <w:r>
-        <w:t xml:space="preserve">Merritt, R. W., Cummins, K. W., &amp; Berg, M. B. (2019).</w:t>
-      </w:r>
-      <w:r>
-        <w:t xml:space="preserve"> </w:t>
-      </w:r>
-      <w:r>
-        <w:rPr>
-          <w:i/>
-          <w:iCs/>
-        </w:rPr>
-        <w:t xml:space="preserve">An introduction to the aquatic insects of north america</w:t>
-      </w:r>
-      <w:r>
-        <w:t xml:space="preserve"> </w:t>
-      </w:r>
-      <w:r>
-        <w:t xml:space="preserve">(5th ed., p. 1480) [Book]. Kendall Hunt Publishing Company.</w:t>
-      </w:r>
-    </w:p>
-    <w:bookmarkEnd w:id="95"/>
-    <w:bookmarkStart w:id="96" w:name="ref-RN782"/>
-    <w:p>
-      <w:pPr>
-        <w:pStyle w:val="Bibliografia"/>
-      </w:pPr>
-      <w:r>
-        <w:t xml:space="preserve">Mugnai, R., Nessimian, J. L., &amp; Baptista, D. F. (2010).</w:t>
-      </w:r>
-      <w:r>
-        <w:t xml:space="preserve"> </w:t>
-      </w:r>
-      <w:r>
-        <w:rPr>
-          <w:i/>
-          <w:iCs/>
-        </w:rPr>
-        <w:t xml:space="preserve">Manual de identificação de macroinvertebrados aquáticos do estado do rio de janeiro</w:t>
-      </w:r>
-      <w:r>
-        <w:t xml:space="preserve"> </w:t>
-      </w:r>
-      <w:r>
-        <w:t xml:space="preserve">(p. 176) [Book]. Technical Books Editora.</w:t>
-      </w:r>
-    </w:p>
-    <w:bookmarkEnd w:id="96"/>
-    <w:bookmarkStart w:id="98" w:name="ref-RN2461"/>
-    <w:p>
-      <w:pPr>
-        <w:pStyle w:val="Bibliografia"/>
-      </w:pPr>
-      <w:r>
-        <w:t xml:space="preserve">Mugodo, J., Kennard, M. J., Liston, P., Nichols, S., Linke, S., Norris, R. H., &amp; Lintermans, M. (2006). Local stream habitat variables predicted from catchment scale characteristics are useful for predicting fish distribution [Journal Article].</w:t>
-      </w:r>
-      <w:r>
-        <w:t xml:space="preserve"> </w:t>
-      </w:r>
-      <w:r>
-        <w:rPr>
-          <w:i/>
-          <w:iCs/>
-        </w:rPr>
-        <w:t xml:space="preserve">Hydrobiologia</w:t>
-      </w:r>
-      <w:r>
-        <w:t xml:space="preserve">,</w:t>
-      </w:r>
-      <w:r>
-        <w:t xml:space="preserve"> </w:t>
-      </w:r>
-      <w:r>
-        <w:rPr>
-          <w:i/>
-          <w:iCs/>
-        </w:rPr>
-        <w:t xml:space="preserve">572</w:t>
-      </w:r>
-      <w:r>
-        <w:t xml:space="preserve">(1), 59–70.</w:t>
-      </w:r>
-      <w:r>
-        <w:t xml:space="preserve"> </w:t>
-      </w:r>
-      <w:hyperlink r:id="rId97">
-        <w:r>
-          <w:rPr>
-            <w:rStyle w:val="Hyperlink"/>
-          </w:rPr>
-          <w:t xml:space="preserve">https://doi.org/10.1007/s10750-006-0252-7</w:t>
-        </w:r>
-      </w:hyperlink>
-    </w:p>
-    <w:bookmarkEnd w:id="98"/>
-    <w:bookmarkStart w:id="100" w:name="ref-RN2832"/>
-    <w:p>
-      <w:pPr>
-        <w:pStyle w:val="Bibliografia"/>
-      </w:pPr>
-      <w:r>
-        <w:t xml:space="preserve">Oksanen, J., Blanchet, F. G., Friendly, M., Kindt, R., Legendre, P., McGlinn, D., Minchin, P. R., O’Hara, R. B., Simpson, G. L., Solymos, P., Stevens, M. H. H., Szoecs, E., &amp; Wagner, H. (2020).</w:t>
-      </w:r>
-      <w:r>
-        <w:t xml:space="preserve"> </w:t>
-      </w:r>
-      <w:r>
-        <w:rPr>
-          <w:i/>
-          <w:iCs/>
-        </w:rPr>
-        <w:t xml:space="preserve">Vegan: Community ecology package. R package version 2.5-7</w:t>
-      </w:r>
-      <w:r>
-        <w:t xml:space="preserve"> </w:t>
-      </w:r>
-      <w:r>
-        <w:t xml:space="preserve">[Report]. The Comprehensive R Archive Network Archive.</w:t>
-      </w:r>
-      <w:r>
-        <w:t xml:space="preserve"> </w:t>
-      </w:r>
-      <w:hyperlink r:id="rId99">
-        <w:r>
-          <w:rPr>
-            <w:rStyle w:val="Hyperlink"/>
-          </w:rPr>
-          <w:t xml:space="preserve">https://cran.r-project.org/web/packages/vegan/vegan.pdf</w:t>
-        </w:r>
-      </w:hyperlink>
-    </w:p>
-    <w:bookmarkEnd w:id="100"/>
-    <w:bookmarkStart w:id="102" w:name="ref-RN2614"/>
-    <w:p>
-      <w:pPr>
-        <w:pStyle w:val="Bibliografia"/>
-      </w:pPr>
-      <w:r>
-        <w:t xml:space="preserve">Peel, M. C., Finlayson, B. L., &amp; McMahon, T. A. (2007). Updated world map of the köppen-geiger climate classification [Journal Article].</w:t>
-      </w:r>
-      <w:r>
-        <w:t xml:space="preserve"> </w:t>
-      </w:r>
-      <w:r>
-        <w:rPr>
-          <w:i/>
-          <w:iCs/>
-        </w:rPr>
-        <w:t xml:space="preserve">Hydrology and Earth System Sciences</w:t>
-      </w:r>
-      <w:r>
-        <w:t xml:space="preserve">,</w:t>
-      </w:r>
-      <w:r>
-        <w:t xml:space="preserve"> </w:t>
-      </w:r>
-      <w:r>
-        <w:rPr>
-          <w:i/>
-          <w:iCs/>
-        </w:rPr>
-        <w:t xml:space="preserve">11</w:t>
-      </w:r>
-      <w:r>
-        <w:t xml:space="preserve">(5), 1633–1644.</w:t>
-      </w:r>
-      <w:r>
-        <w:t xml:space="preserve"> </w:t>
-      </w:r>
-      <w:hyperlink r:id="rId101">
-        <w:r>
-          <w:rPr>
-            <w:rStyle w:val="Hyperlink"/>
-          </w:rPr>
-          <w:t xml:space="preserve">https://doi.org/10.5194/hess-11-1633-2007</w:t>
-        </w:r>
-      </w:hyperlink>
-    </w:p>
-    <w:bookmarkEnd w:id="102"/>
-    <w:bookmarkStart w:id="103" w:name="ref-RN2467"/>
-    <w:p>
-      <w:pPr>
-        <w:pStyle w:val="Bibliografia"/>
-      </w:pPr>
-      <w:r>
-        <w:t xml:space="preserve">Pusey, B., Kennard, M. J., &amp; Arthington, A. (2004). Study area, data collection, analysis and presentation [Book Section]. In B. Pusey, M. J. Kennard, &amp; A. Arthington (Eds.),</w:t>
-      </w:r>
-      <w:r>
-        <w:t xml:space="preserve"> </w:t>
-      </w:r>
-      <w:r>
-        <w:rPr>
-          <w:i/>
-          <w:iCs/>
-        </w:rPr>
-        <w:t xml:space="preserve">Freshwater fishes of north-eastern australia</w:t>
-      </w:r>
-      <w:r>
-        <w:t xml:space="preserve"> </w:t>
-      </w:r>
-      <w:r>
-        <w:t xml:space="preserve">(pp. 26–48). CSIRO Publishing.</w:t>
-      </w:r>
-    </w:p>
-    <w:bookmarkEnd w:id="103"/>
-    <w:bookmarkStart w:id="105" w:name="ref-rocha2012"/>
-    <w:p>
-      <w:pPr>
-        <w:pStyle w:val="Bibliografia"/>
-      </w:pPr>
-      <w:r>
-        <w:t xml:space="preserve">Rocha, L. G., Medeiros, E. S. F., &amp; Andrade, H. T. A. (2012). Influence of flow variability on macroinvertebrate assemblages in an intermittent stream of semi-arid Brazil.</w:t>
-      </w:r>
-      <w:r>
-        <w:t xml:space="preserve"> </w:t>
-      </w:r>
-      <w:r>
-        <w:rPr>
-          <w:i/>
-          <w:iCs/>
-        </w:rPr>
-        <w:t xml:space="preserve">Journal of Arid Environments</w:t>
-      </w:r>
-      <w:r>
-        <w:t xml:space="preserve">,</w:t>
-      </w:r>
-      <w:r>
-        <w:t xml:space="preserve"> </w:t>
-      </w:r>
-      <w:r>
-        <w:rPr>
-          <w:i/>
-          <w:iCs/>
-        </w:rPr>
-        <w:t xml:space="preserve">85</w:t>
-      </w:r>
-      <w:r>
-        <w:t xml:space="preserve">, 33–40.</w:t>
-      </w:r>
-      <w:r>
-        <w:t xml:space="preserve"> </w:t>
-      </w:r>
-      <w:hyperlink r:id="rId104">
-        <w:r>
-          <w:rPr>
-            <w:rStyle w:val="Hyperlink"/>
-          </w:rPr>
-          <w:t xml:space="preserve">https://doi.org/10.1016/j.jaridenv.2012.04.001</w:t>
-        </w:r>
-      </w:hyperlink>
-    </w:p>
-    <w:bookmarkEnd w:id="105"/>
-    <w:bookmarkStart w:id="106" w:name="ref-RN636"/>
-    <w:p>
-      <w:pPr>
-        <w:pStyle w:val="Bibliografia"/>
-      </w:pPr>
-      <w:r>
-        <w:t xml:space="preserve">Ross, S. T., McMichael, Jr., Robert H., &amp; Ruple, D. L. (1987). Seasonal and diel variation in the standing crop of fishes and macroinvertebrates from gulf of mexico surf zone [Journal Article].</w:t>
-      </w:r>
-      <w:r>
-        <w:t xml:space="preserve"> </w:t>
-      </w:r>
-      <w:r>
-        <w:rPr>
-          <w:i/>
-          <w:iCs/>
-        </w:rPr>
-        <w:t xml:space="preserve">Estuarine, Coastal and Shelf Science</w:t>
-      </w:r>
-      <w:r>
-        <w:t xml:space="preserve">,</w:t>
-      </w:r>
-      <w:r>
-        <w:t xml:space="preserve"> </w:t>
-      </w:r>
-      <w:r>
-        <w:rPr>
-          <w:i/>
-          <w:iCs/>
-        </w:rPr>
-        <w:t xml:space="preserve">25</w:t>
-      </w:r>
-      <w:r>
-        <w:t xml:space="preserve">, 391–412.</w:t>
-      </w:r>
-    </w:p>
-    <w:bookmarkEnd w:id="106"/>
-    <w:bookmarkStart w:id="108" w:name="ref-RN1788"/>
-    <w:p>
-      <w:pPr>
-        <w:pStyle w:val="Bibliografia"/>
-      </w:pPr>
-      <w:r>
-        <w:t xml:space="preserve">Silva, J. M. C., Leal, I. R., &amp; Tabarelli, M. (2017).</w:t>
-      </w:r>
-      <w:r>
-        <w:t xml:space="preserve"> </w:t>
-      </w:r>
-      <w:r>
-        <w:rPr>
-          <w:i/>
-          <w:iCs/>
-        </w:rPr>
-        <w:t xml:space="preserve">Caatinga: The largest tropical dry forest region in south america</w:t>
-      </w:r>
-      <w:r>
-        <w:t xml:space="preserve"> </w:t>
-      </w:r>
-      <w:r>
-        <w:t xml:space="preserve">[Edited Book]. Springer.</w:t>
-      </w:r>
-      <w:r>
-        <w:t xml:space="preserve"> </w:t>
-      </w:r>
-      <w:hyperlink r:id="rId107">
-        <w:r>
-          <w:rPr>
-            <w:rStyle w:val="Hyperlink"/>
-          </w:rPr>
-          <w:t xml:space="preserve">https://doi.org/10.1007/978-3-319-68339-3</w:t>
-        </w:r>
-      </w:hyperlink>
-    </w:p>
-    <w:bookmarkEnd w:id="108"/>
-    <w:bookmarkStart w:id="109" w:name="ref-RN67"/>
-    <w:p>
-      <w:pPr>
-        <w:pStyle w:val="Bibliografia"/>
-      </w:pPr>
-      <w:r>
-        <w:t xml:space="preserve">Sokal, R. R., &amp; Rohlf, F. J. (1995).</w:t>
-      </w:r>
-      <w:r>
-        <w:t xml:space="preserve"> </w:t>
-      </w:r>
-      <w:r>
-        <w:rPr>
-          <w:i/>
-          <w:iCs/>
-        </w:rPr>
-        <w:t xml:space="preserve">Biometry: The principles and practice of statistics in biological research</w:t>
-      </w:r>
-      <w:r>
-        <w:t xml:space="preserve"> </w:t>
-      </w:r>
-      <w:r>
-        <w:t xml:space="preserve">(3rd ed., p. 776) [Book]. W.H. Freeman; Company.</w:t>
-      </w:r>
-    </w:p>
-    <w:bookmarkEnd w:id="109"/>
-    <w:bookmarkStart w:id="111" w:name="ref-RN2774"/>
-    <w:p>
-      <w:pPr>
-        <w:pStyle w:val="Bibliografia"/>
-      </w:pPr>
-      <w:r>
-        <w:t xml:space="preserve">Team, R. D. C. (2017).</w:t>
-      </w:r>
-      <w:r>
-        <w:t xml:space="preserve"> </w:t>
-      </w:r>
-      <w:r>
-        <w:rPr>
-          <w:i/>
-          <w:iCs/>
-        </w:rPr>
-        <w:t xml:space="preserve">R: A language and environment for statistical computing</w:t>
-      </w:r>
-      <w:r>
-        <w:t xml:space="preserve"> </w:t>
-      </w:r>
-      <w:r>
-        <w:t xml:space="preserve">[Book]. R Foundation for Statistical Computing.</w:t>
-      </w:r>
-      <w:r>
-        <w:t xml:space="preserve"> </w:t>
-      </w:r>
-      <w:hyperlink r:id="rId110">
-        <w:r>
-          <w:rPr>
-            <w:rStyle w:val="Hyperlink"/>
-          </w:rPr>
-          <w:t xml:space="preserve">https://www.r-project.org/</w:t>
-        </w:r>
-      </w:hyperlink>
-    </w:p>
-    <w:bookmarkEnd w:id="111"/>
-    <w:bookmarkStart w:id="112" w:name="ref-RN188"/>
-    <w:p>
-      <w:pPr>
-        <w:pStyle w:val="Bibliografia"/>
-      </w:pPr>
-      <w:r>
-        <w:t xml:space="preserve">Thorp, J. H., &amp; Covich, A. P. (2010).</w:t>
-      </w:r>
-      <w:r>
-        <w:t xml:space="preserve"> </w:t>
-      </w:r>
-      <w:r>
-        <w:rPr>
-          <w:i/>
-          <w:iCs/>
-        </w:rPr>
-        <w:t xml:space="preserve">Ecology and classification of north american freshwater invertebrates</w:t>
-      </w:r>
-      <w:r>
-        <w:t xml:space="preserve"> </w:t>
-      </w:r>
-      <w:r>
-        <w:t xml:space="preserve">(3rd ed.) [Edited Book]. Academic Press.</w:t>
-      </w:r>
-    </w:p>
-    <w:bookmarkEnd w:id="112"/>
-    <w:bookmarkStart w:id="114" w:name="ref-RN3029"/>
-    <w:p>
-      <w:pPr>
-        <w:pStyle w:val="Bibliografia"/>
-      </w:pPr>
-      <w:r>
-        <w:t xml:space="preserve">Tichý, L., &amp; Chytry, M. (2006). Statistical determination of diagnostic species for site groups of unequal size [Journal Article].</w:t>
-      </w:r>
-      <w:r>
-        <w:t xml:space="preserve"> </w:t>
-      </w:r>
-      <w:r>
-        <w:rPr>
-          <w:i/>
-          <w:iCs/>
-        </w:rPr>
-        <w:t xml:space="preserve">Journal of Vegetation Science</w:t>
-      </w:r>
-      <w:r>
-        <w:t xml:space="preserve">,</w:t>
-      </w:r>
-      <w:r>
-        <w:t xml:space="preserve"> </w:t>
-      </w:r>
-      <w:r>
-        <w:rPr>
-          <w:i/>
-          <w:iCs/>
-        </w:rPr>
-        <w:t xml:space="preserve">17</w:t>
-      </w:r>
-      <w:r>
-        <w:t xml:space="preserve">, 809–818.</w:t>
-      </w:r>
-      <w:r>
-        <w:t xml:space="preserve"> </w:t>
-      </w:r>
-      <w:hyperlink r:id="rId113">
-        <w:r>
-          <w:rPr>
-            <w:rStyle w:val="Hyperlink"/>
-          </w:rPr>
-          <w:t xml:space="preserve">https://doi.org/10.1111/j.1654-1103.2006.tb02504.x</w:t>
-        </w:r>
-      </w:hyperlink>
-    </w:p>
-    <w:bookmarkEnd w:id="114"/>
-    <w:bookmarkStart w:id="116" w:name="ref-RN2991"/>
-    <w:p>
-      <w:pPr>
-        <w:pStyle w:val="Bibliografia"/>
-      </w:pPr>
-      <w:r>
-        <w:t xml:space="preserve">Venables, W. N., &amp; Ripley, B. D. (2002).</w:t>
-      </w:r>
-      <w:r>
-        <w:t xml:space="preserve"> </w:t>
-      </w:r>
-      <w:r>
-        <w:rPr>
-          <w:i/>
-          <w:iCs/>
-        </w:rPr>
-        <w:t xml:space="preserve">Modern applied statistics with s</w:t>
-      </w:r>
-      <w:r>
-        <w:t xml:space="preserve"> </w:t>
-      </w:r>
-      <w:r>
-        <w:t xml:space="preserve">(4th ed.) [Book]. Springer.</w:t>
-      </w:r>
-      <w:r>
-        <w:t xml:space="preserve"> </w:t>
-      </w:r>
-      <w:hyperlink r:id="rId115">
-        <w:r>
-          <w:rPr>
-            <w:rStyle w:val="Hyperlink"/>
-          </w:rPr>
-          <w:t xml:space="preserve">https://www.stats.ox.ac.uk/pub/MASS4/</w:t>
-        </w:r>
-      </w:hyperlink>
-    </w:p>
-    <w:bookmarkEnd w:id="116"/>
-    <w:bookmarkStart w:id="118" w:name="ref-RN2907"/>
-    <w:p>
-      <w:pPr>
-        <w:pStyle w:val="Bibliografia"/>
-      </w:pPr>
-      <w:r>
-        <w:t xml:space="preserve">Vendramin, D., Klagenberg, C. S., Provensi, M. R., Stenert, C., Pires, M. M., Medeiros, E. S. F., Reichard, M., &amp; Maltchik, L. (2020). Effects of the presence of annual killifish on the assemblage structure of resting stages of aquatic invertebrates in temporary ponds [Journal Article].</w:t>
-      </w:r>
-      <w:r>
-        <w:t xml:space="preserve"> </w:t>
-      </w:r>
-      <w:r>
-        <w:rPr>
-          <w:i/>
-          <w:iCs/>
-        </w:rPr>
-        <w:t xml:space="preserve">Limnetica</w:t>
-      </w:r>
-      <w:r>
-        <w:t xml:space="preserve">,</w:t>
-      </w:r>
-      <w:r>
-        <w:t xml:space="preserve"> </w:t>
-      </w:r>
-      <w:r>
-        <w:rPr>
-          <w:i/>
-          <w:iCs/>
-        </w:rPr>
-        <w:t xml:space="preserve">39</w:t>
-      </w:r>
-      <w:r>
-        <w:t xml:space="preserve">(1), 1–16.</w:t>
-      </w:r>
-      <w:r>
-        <w:t xml:space="preserve"> </w:t>
-      </w:r>
-      <w:hyperlink r:id="rId117">
-        <w:r>
-          <w:rPr>
-            <w:rStyle w:val="Hyperlink"/>
-          </w:rPr>
-          <w:t xml:space="preserve">https://doi.org/10.23818/limn.39.01</w:t>
-        </w:r>
-      </w:hyperlink>
-    </w:p>
-    <w:bookmarkEnd w:id="118"/>
-    <w:bookmarkStart w:id="119" w:name="ref-RN158"/>
-    <w:p>
-      <w:pPr>
-        <w:pStyle w:val="Bibliografia"/>
-      </w:pPr>
-      <w:r>
-        <w:t xml:space="preserve">Zar, J. H. (1999).</w:t>
-      </w:r>
-      <w:r>
-        <w:t xml:space="preserve"> </w:t>
-      </w:r>
-      <w:r>
-        <w:rPr>
-          <w:i/>
-          <w:iCs/>
-        </w:rPr>
-        <w:t xml:space="preserve">Biostatistical analysis</w:t>
-      </w:r>
-      <w:r>
-        <w:t xml:space="preserve"> </w:t>
-      </w:r>
-      <w:r>
-        <w:t xml:space="preserve">(4th ed., p. 663) [Book]. Prentice Hall.</w:t>
-      </w:r>
-    </w:p>
-    <w:bookmarkEnd w:id="119"/>
-    <w:bookmarkEnd w:id="120"/>
-    <w:bookmarkEnd w:id="121"/>
-    <w:bookmarkStart w:id="146" w:name="figures-and-tables"/>
+    <w:bookmarkEnd w:id="37"/>
+    <w:bookmarkEnd w:id="38"/>
+    <w:bookmarkEnd w:id="39"/>
+    <w:bookmarkStart w:id="64" w:name="figures-and-tables"/>
     <w:p>
       <w:pPr>
         <w:pStyle w:val="Ttulo1"/>
@@ -4185,7 +2658,7 @@
         <w:t xml:space="preserve">Table II. Summary of CCA axes of environmental variables and benthic macroinvertebrates collected from aquatic ecosystems in Brazilian semi-arid during 2006 hydrological cycle.</w:t>
       </w:r>
     </w:p>
-    <w:bookmarkStart w:id="142" w:name="figures"/>
+    <w:bookmarkStart w:id="60" w:name="figures"/>
     <w:p>
       <w:pPr>
         <w:pStyle w:val="Ttulo2"/>
@@ -4215,7 +2688,7 @@
       <w:tr>
         <w:tc>
           <w:tcPr/>
-          <w:bookmarkStart w:id="125" w:name="fig-mapa"/>
+          <w:bookmarkStart w:id="43" w:name="fig-mapa"/>
           <w:p>
             <w:pPr>
               <w:pStyle w:val="Compact"/>
@@ -4226,18 +2699,18 @@
                 <wp:inline>
                   <wp:extent cx="5600700" cy="3957682"/>
                   <wp:effectExtent b="0" l="0" r="0" t="0"/>
-                  <wp:docPr descr="" title="" id="123" name="Picture"/>
+                  <wp:docPr descr="" title="" id="41" name="Picture"/>
                   <a:graphic>
                     <a:graphicData uri="http://schemas.openxmlformats.org/drawingml/2006/picture">
                       <pic:pic>
                         <pic:nvPicPr>
-                          <pic:cNvPr descr="mapa_final.jpeg" id="124" name="Picture"/>
+                          <pic:cNvPr descr="mapa_final.jpeg" id="42" name="Picture"/>
                           <pic:cNvPicPr>
                             <a:picLocks noChangeArrowheads="1" noChangeAspect="1"/>
                           </pic:cNvPicPr>
                         </pic:nvPicPr>
                         <pic:blipFill>
-                          <a:blip r:embed="rId122"/>
+                          <a:blip r:embed="rId40"/>
                           <a:stretch>
                             <a:fillRect/>
                           </a:stretch>
@@ -4277,7 +2750,7 @@
               <w:t xml:space="preserve">Figure 1: Study sites in semiarid Brazil.</w:t>
             </w:r>
           </w:p>
-          <w:bookmarkEnd w:id="125"/>
+          <w:bookmarkEnd w:id="43"/>
         </w:tc>
       </w:tr>
     </w:tbl>
@@ -4302,7 +2775,7 @@
       <w:tr>
         <w:tc>
           <w:tcPr/>
-          <w:bookmarkStart w:id="129" w:name="fig-hab_pcafviz"/>
+          <w:bookmarkStart w:id="47" w:name="fig-hab_pcafviz"/>
           <w:p>
             <w:pPr>
               <w:pStyle w:val="Compact"/>
@@ -4313,18 +2786,18 @@
                 <wp:inline>
                   <wp:extent cx="5600700" cy="4582390"/>
                   <wp:effectExtent b="0" l="0" r="0" t="0"/>
-                  <wp:docPr descr="" title="" id="127" name="Picture"/>
+                  <wp:docPr descr="" title="" id="45" name="Picture"/>
                   <a:graphic>
                     <a:graphicData uri="http://schemas.openxmlformats.org/drawingml/2006/picture">
                       <pic:pic>
                         <pic:nvPicPr>
-                          <pic:cNvPr descr="fig-hab_PCA_fviz.png" id="128" name="Picture"/>
+                          <pic:cNvPr descr="fig-hab_PCA_fviz.png" id="46" name="Picture"/>
                           <pic:cNvPicPr>
                             <a:picLocks noChangeArrowheads="1" noChangeAspect="1"/>
                           </pic:cNvPicPr>
                         </pic:nvPicPr>
                         <pic:blipFill>
-                          <a:blip r:embed="rId126"/>
+                          <a:blip r:embed="rId44"/>
                           <a:stretch>
                             <a:fillRect/>
                           </a:stretch>
@@ -4379,7 +2852,7 @@
               <w:t xml:space="preserve">function.</w:t>
             </w:r>
           </w:p>
-          <w:bookmarkEnd w:id="129"/>
+          <w:bookmarkEnd w:id="47"/>
         </w:tc>
       </w:tr>
     </w:tbl>
@@ -4404,7 +2877,7 @@
       <w:tr>
         <w:tc>
           <w:tcPr/>
-          <w:bookmarkStart w:id="133" w:name="fig-rarerich"/>
+          <w:bookmarkStart w:id="51" w:name="fig-rarerich"/>
           <w:p>
             <w:pPr>
               <w:pStyle w:val="Compact"/>
@@ -4415,18 +2888,18 @@
                 <wp:inline>
                   <wp:extent cx="5600700" cy="5600700"/>
                   <wp:effectExtent b="0" l="0" r="0" t="0"/>
-                  <wp:docPr descr="" title="" id="131" name="Picture"/>
+                  <wp:docPr descr="" title="" id="49" name="Picture"/>
                   <a:graphic>
                     <a:graphicData uri="http://schemas.openxmlformats.org/drawingml/2006/picture">
                       <pic:pic>
                         <pic:nvPicPr>
-                          <pic:cNvPr descr="fig-rarerich.png" id="132" name="Picture"/>
+                          <pic:cNvPr descr="fig-rarerich.png" id="50" name="Picture"/>
                           <pic:cNvPicPr>
                             <a:picLocks noChangeArrowheads="1" noChangeAspect="1"/>
                           </pic:cNvPicPr>
                         </pic:nvPicPr>
                         <pic:blipFill>
-                          <a:blip r:embed="rId130"/>
+                          <a:blip r:embed="rId48"/>
                           <a:stretch>
                             <a:fillRect/>
                           </a:stretch>
@@ -4466,7 +2939,7 @@
               <w:t xml:space="preserve">Figure 3: Variation in rarefied richness across study sites.</w:t>
             </w:r>
           </w:p>
-          <w:bookmarkEnd w:id="133"/>
+          <w:bookmarkEnd w:id="51"/>
         </w:tc>
       </w:tr>
     </w:tbl>
@@ -4491,7 +2964,7 @@
       <w:tr>
         <w:tc>
           <w:tcPr/>
-          <w:bookmarkStart w:id="137" w:name="fig-nmds"/>
+          <w:bookmarkStart w:id="55" w:name="fig-nmds"/>
           <w:p>
             <w:pPr>
               <w:pStyle w:val="Compact"/>
@@ -4502,18 +2975,18 @@
                 <wp:inline>
                   <wp:extent cx="5600700" cy="4356100"/>
                   <wp:effectExtent b="0" l="0" r="0" t="0"/>
-                  <wp:docPr descr="" title="" id="135" name="Picture"/>
+                  <wp:docPr descr="" title="" id="53" name="Picture"/>
                   <a:graphic>
                     <a:graphicData uri="http://schemas.openxmlformats.org/drawingml/2006/picture">
                       <pic:pic>
                         <pic:nvPicPr>
-                          <pic:cNvPr descr="fig-nmds.png" id="136" name="Picture"/>
+                          <pic:cNvPr descr="fig-nmds.png" id="54" name="Picture"/>
                           <pic:cNvPicPr>
                             <a:picLocks noChangeArrowheads="1" noChangeAspect="1"/>
                           </pic:cNvPicPr>
                         </pic:nvPicPr>
                         <pic:blipFill>
-                          <a:blip r:embed="rId134"/>
+                          <a:blip r:embed="rId52"/>
                           <a:stretch>
                             <a:fillRect/>
                           </a:stretch>
@@ -4553,7 +3026,7 @@
               <w:t xml:space="preserve">Figure 4: Community data NMDS.</w:t>
             </w:r>
           </w:p>
-          <w:bookmarkEnd w:id="137"/>
+          <w:bookmarkEnd w:id="55"/>
         </w:tc>
       </w:tr>
     </w:tbl>
@@ -4578,7 +3051,7 @@
       <w:tr>
         <w:tc>
           <w:tcPr/>
-          <w:bookmarkStart w:id="141" w:name="fig-rda"/>
+          <w:bookmarkStart w:id="59" w:name="fig-rda"/>
           <w:p>
             <w:pPr>
               <w:pStyle w:val="Compact"/>
@@ -4589,18 +3062,18 @@
                 <wp:inline>
                   <wp:extent cx="5600700" cy="5600700"/>
                   <wp:effectExtent b="0" l="0" r="0" t="0"/>
-                  <wp:docPr descr="" title="" id="139" name="Picture"/>
+                  <wp:docPr descr="" title="" id="57" name="Picture"/>
                   <a:graphic>
                     <a:graphicData uri="http://schemas.openxmlformats.org/drawingml/2006/picture">
                       <pic:pic>
                         <pic:nvPicPr>
-                          <pic:cNvPr descr="fig-rda_panel.png" id="140" name="Picture"/>
+                          <pic:cNvPr descr="fig-rda_panel.png" id="58" name="Picture"/>
                           <pic:cNvPicPr>
                             <a:picLocks noChangeArrowheads="1" noChangeAspect="1"/>
                           </pic:cNvPicPr>
                         </pic:nvPicPr>
                         <pic:blipFill>
-                          <a:blip r:embed="rId138"/>
+                          <a:blip r:embed="rId56"/>
                           <a:stretch>
                             <a:fillRect/>
                           </a:stretch>
@@ -4640,12 +3113,12 @@
               <w:t xml:space="preserve">Figure 5: Redundace Analisys.</w:t>
             </w:r>
           </w:p>
-          <w:bookmarkEnd w:id="141"/>
+          <w:bookmarkEnd w:id="59"/>
         </w:tc>
       </w:tr>
     </w:tbl>
-    <w:bookmarkEnd w:id="142"/>
-    <w:bookmarkStart w:id="145" w:name="tables"/>
+    <w:bookmarkEnd w:id="60"/>
+    <w:bookmarkStart w:id="63" w:name="tables"/>
     <w:p>
       <w:pPr>
         <w:pStyle w:val="Ttulo2"/>
@@ -4675,7 +3148,7 @@
       <w:tr>
         <w:tc>
           <w:tcPr/>
-          <w:bookmarkStart w:id="143" w:name="tbl-hab_gttable"/>
+          <w:bookmarkStart w:id="61" w:name="tbl-hab_gttable"/>
           <w:p>
             <w:pPr>
               <w:jc w:val="center"/>
@@ -10008,7 +8481,7 @@
               </w:tc>
             </w:tr>
           </w:tbl>
-          <w:bookmarkEnd w:id="143"/>
+          <w:bookmarkEnd w:id="61"/>
         </w:tc>
       </w:tr>
     </w:tbl>
@@ -10033,7 +8506,7 @@
       <w:tr>
         <w:tc>
           <w:tcPr/>
-          <w:bookmarkStart w:id="144" w:name="tbl-spp_gttable"/>
+          <w:bookmarkStart w:id="62" w:name="tbl-spp_gttable"/>
           <w:p>
             <w:pPr>
               <w:jc w:val="center"/>
@@ -19512,13 +17985,13 @@
               </w:tc>
             </w:tr>
           </w:tbl>
-          <w:bookmarkEnd w:id="144"/>
+          <w:bookmarkEnd w:id="62"/>
         </w:tc>
       </w:tr>
     </w:tbl>
-    <w:bookmarkEnd w:id="145"/>
-    <w:bookmarkEnd w:id="146"/>
-    <w:bookmarkStart w:id="147" w:name="apendices"/>
+    <w:bookmarkEnd w:id="63"/>
+    <w:bookmarkEnd w:id="64"/>
+    <w:bookmarkStart w:id="65" w:name="apendices"/>
     <w:p>
       <w:pPr>
         <w:pStyle w:val="Ttulo1"/>
@@ -19527,8 +18000,8 @@
         <w:t xml:space="preserve">Apendices</w:t>
       </w:r>
     </w:p>
-    <w:bookmarkEnd w:id="147"/>
-    <w:bookmarkStart w:id="179" w:name="non-used-figures-and-tables"/>
+    <w:bookmarkEnd w:id="65"/>
+    <w:bookmarkStart w:id="97" w:name="non-used-figures-and-tables"/>
     <w:p>
       <w:pPr>
         <w:pStyle w:val="Ttulo1"/>
@@ -19558,7 +18031,7 @@
       <w:tr>
         <w:tc>
           <w:tcPr/>
-          <w:bookmarkStart w:id="151" w:name="fig-hab_pairs"/>
+          <w:bookmarkStart w:id="69" w:name="fig-hab_pairs"/>
           <w:p>
             <w:pPr>
               <w:pStyle w:val="Compact"/>
@@ -19569,18 +18042,18 @@
                 <wp:inline>
                   <wp:extent cx="5600700" cy="5600700"/>
                   <wp:effectExtent b="0" l="0" r="0" t="0"/>
-                  <wp:docPr descr="" title="" id="149" name="Picture"/>
+                  <wp:docPr descr="" title="" id="67" name="Picture"/>
                   <a:graphic>
                     <a:graphicData uri="http://schemas.openxmlformats.org/drawingml/2006/picture">
                       <pic:pic>
                         <pic:nvPicPr>
-                          <pic:cNvPr descr="fig-hab_pairs.png" id="150" name="Picture"/>
+                          <pic:cNvPr descr="fig-hab_pairs.png" id="68" name="Picture"/>
                           <pic:cNvPicPr>
                             <a:picLocks noChangeArrowheads="1" noChangeAspect="1"/>
                           </pic:cNvPicPr>
                         </pic:nvPicPr>
                         <pic:blipFill>
-                          <a:blip r:embed="rId148"/>
+                          <a:blip r:embed="rId66"/>
                           <a:stretch>
                             <a:fillRect/>
                           </a:stretch>
@@ -19620,7 +18093,7 @@
               <w:t xml:space="preserve">Figure 6: Environment variables correlations pairs.</w:t>
             </w:r>
           </w:p>
-          <w:bookmarkEnd w:id="151"/>
+          <w:bookmarkEnd w:id="69"/>
         </w:tc>
       </w:tr>
     </w:tbl>
@@ -19645,7 +18118,7 @@
       <w:tr>
         <w:tc>
           <w:tcPr/>
-          <w:bookmarkStart w:id="155" w:name="fig-hab_corrplot"/>
+          <w:bookmarkStart w:id="73" w:name="fig-hab_corrplot"/>
           <w:p>
             <w:pPr>
               <w:pStyle w:val="Compact"/>
@@ -19656,18 +18129,18 @@
                 <wp:inline>
                   <wp:extent cx="5600700" cy="5600700"/>
                   <wp:effectExtent b="0" l="0" r="0" t="0"/>
-                  <wp:docPr descr="" title="" id="153" name="Picture"/>
+                  <wp:docPr descr="" title="" id="71" name="Picture"/>
                   <a:graphic>
                     <a:graphicData uri="http://schemas.openxmlformats.org/drawingml/2006/picture">
                       <pic:pic>
                         <pic:nvPicPr>
-                          <pic:cNvPr descr="fig-hab_corrplot.png" id="154" name="Picture"/>
+                          <pic:cNvPr descr="fig-hab_corrplot.png" id="72" name="Picture"/>
                           <pic:cNvPicPr>
                             <a:picLocks noChangeArrowheads="1" noChangeAspect="1"/>
                           </pic:cNvPicPr>
                         </pic:nvPicPr>
                         <pic:blipFill>
-                          <a:blip r:embed="rId152"/>
+                          <a:blip r:embed="rId70"/>
                           <a:stretch>
                             <a:fillRect/>
                           </a:stretch>
@@ -19707,7 +18180,7 @@
               <w:t xml:space="preserve">Figure 7: Habitat variables correlations correlogram.</w:t>
             </w:r>
           </w:p>
-          <w:bookmarkEnd w:id="155"/>
+          <w:bookmarkEnd w:id="73"/>
         </w:tc>
       </w:tr>
     </w:tbl>
@@ -19732,7 +18205,7 @@
       <w:tr>
         <w:tc>
           <w:tcPr/>
-          <w:bookmarkStart w:id="159" w:name="fig-hab_pcarbase"/>
+          <w:bookmarkStart w:id="77" w:name="fig-hab_pcarbase"/>
           <w:p>
             <w:pPr>
               <w:pStyle w:val="Compact"/>
@@ -19743,18 +18216,18 @@
                 <wp:inline>
                   <wp:extent cx="5600700" cy="5600700"/>
                   <wp:effectExtent b="0" l="0" r="0" t="0"/>
-                  <wp:docPr descr="" title="" id="157" name="Picture"/>
+                  <wp:docPr descr="" title="" id="75" name="Picture"/>
                   <a:graphic>
                     <a:graphicData uri="http://schemas.openxmlformats.org/drawingml/2006/picture">
                       <pic:pic>
                         <pic:nvPicPr>
-                          <pic:cNvPr descr="fig-hab_PCA_rbase.png" id="158" name="Picture"/>
+                          <pic:cNvPr descr="fig-hab_PCA_rbase.png" id="76" name="Picture"/>
                           <pic:cNvPicPr>
                             <a:picLocks noChangeArrowheads="1" noChangeAspect="1"/>
                           </pic:cNvPicPr>
                         </pic:nvPicPr>
                         <pic:blipFill>
-                          <a:blip r:embed="rId156"/>
+                          <a:blip r:embed="rId74"/>
                           <a:stretch>
                             <a:fillRect/>
                           </a:stretch>
@@ -19824,7 +18297,7 @@
               <w:t xml:space="preserve">functions.</w:t>
             </w:r>
           </w:p>
-          <w:bookmarkEnd w:id="159"/>
+          <w:bookmarkEnd w:id="77"/>
         </w:tc>
       </w:tr>
     </w:tbl>
@@ -19849,7 +18322,7 @@
       <w:tr>
         <w:tc>
           <w:tcPr/>
-          <w:bookmarkStart w:id="163" w:name="fig-sig_spp"/>
+          <w:bookmarkStart w:id="81" w:name="fig-sig_spp"/>
           <w:p>
             <w:pPr>
               <w:pStyle w:val="Compact"/>
@@ -19860,18 +18333,18 @@
                 <wp:inline>
                   <wp:extent cx="5600700" cy="5600700"/>
                   <wp:effectExtent b="0" l="0" r="0" t="0"/>
-                  <wp:docPr descr="" title="" id="161" name="Picture"/>
+                  <wp:docPr descr="" title="" id="79" name="Picture"/>
                   <a:graphic>
                     <a:graphicData uri="http://schemas.openxmlformats.org/drawingml/2006/picture">
                       <pic:pic>
                         <pic:nvPicPr>
-                          <pic:cNvPr descr="fig-sig_spp.png" id="162" name="Picture"/>
+                          <pic:cNvPr descr="fig-sig_spp.png" id="80" name="Picture"/>
                           <pic:cNvPicPr>
                             <a:picLocks noChangeArrowheads="1" noChangeAspect="1"/>
                           </pic:cNvPicPr>
                         </pic:nvPicPr>
                         <pic:blipFill>
-                          <a:blip r:embed="rId160"/>
+                          <a:blip r:embed="rId78"/>
                           <a:stretch>
                             <a:fillRect/>
                           </a:stretch>
@@ -19911,7 +18384,7 @@
               <w:t xml:space="preserve">Figure 9: Multilevel Pattern Analysis of indicator species.</w:t>
             </w:r>
           </w:p>
-          <w:bookmarkEnd w:id="163"/>
+          <w:bookmarkEnd w:id="81"/>
         </w:tc>
       </w:tr>
     </w:tbl>
@@ -19936,7 +18409,7 @@
       <w:tr>
         <w:tc>
           <w:tcPr/>
-          <w:bookmarkStart w:id="167" w:name="fig-hab_gttable"/>
+          <w:bookmarkStart w:id="85" w:name="fig-hab_gttable"/>
           <w:p>
             <w:pPr>
               <w:pStyle w:val="Compact"/>
@@ -19947,18 +18420,18 @@
                 <wp:inline>
                   <wp:extent cx="5600700" cy="10940718"/>
                   <wp:effectExtent b="0" l="0" r="0" t="0"/>
-                  <wp:docPr descr="" title="" id="165" name="Picture"/>
+                  <wp:docPr descr="" title="" id="83" name="Picture"/>
                   <a:graphic>
                     <a:graphicData uri="http://schemas.openxmlformats.org/drawingml/2006/picture">
                       <pic:pic>
                         <pic:nvPicPr>
-                          <pic:cNvPr descr="fig-hab_gttable.png" id="166" name="Picture"/>
+                          <pic:cNvPr descr="fig-hab_gttable.png" id="84" name="Picture"/>
                           <pic:cNvPicPr>
                             <a:picLocks noChangeArrowheads="1" noChangeAspect="1"/>
                           </pic:cNvPicPr>
                         </pic:nvPicPr>
                         <pic:blipFill>
-                          <a:blip r:embed="rId164"/>
+                          <a:blip r:embed="rId82"/>
                           <a:stretch>
                             <a:fillRect/>
                           </a:stretch>
@@ -19998,7 +18471,7 @@
               <w:t xml:space="preserve">Figure 10: Environment data GT table</w:t>
             </w:r>
           </w:p>
-          <w:bookmarkEnd w:id="167"/>
+          <w:bookmarkEnd w:id="85"/>
         </w:tc>
       </w:tr>
     </w:tbl>
@@ -20023,7 +18496,7 @@
       <w:tr>
         <w:tc>
           <w:tcPr/>
-          <w:bookmarkStart w:id="171" w:name="fig-density_tab"/>
+          <w:bookmarkStart w:id="89" w:name="fig-density_tab"/>
           <w:p>
             <w:pPr>
               <w:pStyle w:val="Compact"/>
@@ -20034,18 +18507,18 @@
                 <wp:inline>
                   <wp:extent cx="5600700" cy="23267772"/>
                   <wp:effectExtent b="0" l="0" r="0" t="0"/>
-                  <wp:docPr descr="" title="" id="169" name="Picture"/>
+                  <wp:docPr descr="" title="" id="87" name="Picture"/>
                   <a:graphic>
                     <a:graphicData uri="http://schemas.openxmlformats.org/drawingml/2006/picture">
                       <pic:pic>
                         <pic:nvPicPr>
-                          <pic:cNvPr descr="fig-spp_gttable.png" id="170" name="Picture"/>
+                          <pic:cNvPr descr="fig-spp_gttable.png" id="88" name="Picture"/>
                           <pic:cNvPicPr>
                             <a:picLocks noChangeArrowheads="1" noChangeAspect="1"/>
                           </pic:cNvPicPr>
                         </pic:nvPicPr>
                         <pic:blipFill>
-                          <a:blip r:embed="rId168"/>
+                          <a:blip r:embed="rId86"/>
                           <a:stretch>
                             <a:fillRect/>
                           </a:stretch>
@@ -20085,7 +18558,7 @@
               <w:t xml:space="preserve">Figure 11: Density of species data table.</w:t>
             </w:r>
           </w:p>
-          <w:bookmarkEnd w:id="171"/>
+          <w:bookmarkEnd w:id="89"/>
         </w:tc>
       </w:tr>
     </w:tbl>
@@ -20110,7 +18583,7 @@
       <w:tr>
         <w:tc>
           <w:tcPr/>
-          <w:bookmarkStart w:id="175" w:name="fig-descrspp_tab"/>
+          <w:bookmarkStart w:id="93" w:name="fig-descrspp_tab"/>
           <w:p>
             <w:pPr>
               <w:pStyle w:val="Compact"/>
@@ -20121,18 +18594,18 @@
                 <wp:inline>
                   <wp:extent cx="5600700" cy="10639977"/>
                   <wp:effectExtent b="0" l="0" r="0" t="0"/>
-                  <wp:docPr descr="" title="" id="173" name="Picture"/>
+                  <wp:docPr descr="" title="" id="91" name="Picture"/>
                   <a:graphic>
                     <a:graphicData uri="http://schemas.openxmlformats.org/drawingml/2006/picture">
                       <pic:pic>
                         <pic:nvPicPr>
-                          <pic:cNvPr descr="DescritoresSPP.png" id="174" name="Picture"/>
+                          <pic:cNvPr descr="DescritoresSPP.png" id="92" name="Picture"/>
                           <pic:cNvPicPr>
                             <a:picLocks noChangeArrowheads="1" noChangeAspect="1"/>
                           </pic:cNvPicPr>
                         </pic:nvPicPr>
                         <pic:blipFill>
-                          <a:blip r:embed="rId172"/>
+                          <a:blip r:embed="rId90"/>
                           <a:stretch>
                             <a:fillRect/>
                           </a:stretch>
@@ -20172,7 +18645,7 @@
               <w:t xml:space="preserve">Figure 12: Diversity descriptors of the community structure data table.</w:t>
             </w:r>
           </w:p>
-          <w:bookmarkEnd w:id="175"/>
+          <w:bookmarkEnd w:id="93"/>
         </w:tc>
       </w:tr>
     </w:tbl>
@@ -20217,18 +18690,18 @@
                 <wp:inline>
                   <wp:extent cx="152400" cy="152400"/>
                   <wp:effectExtent b="0" l="0" r="0" t="0"/>
-                  <wp:docPr descr="" title="" id="177" name="Picture"/>
+                  <wp:docPr descr="" title="" id="95" name="Picture"/>
                   <a:graphic>
                     <a:graphicData uri="http://schemas.openxmlformats.org/drawingml/2006/picture">
                       <pic:pic>
                         <pic:nvPicPr>
-                          <pic:cNvPr descr="C:\PROGRA~1\RStudio\RESOUR~1\app\bin\quarto\share\formats\docx\warning.png" id="178" name="Picture"/>
+                          <pic:cNvPr descr="C:\PROGRA~1\RStudio\RESOUR~1\app\bin\quarto\share\formats\docx\warning.png" id="96" name="Picture"/>
                           <pic:cNvPicPr>
                             <a:picLocks noChangeArrowheads="1" noChangeAspect="1"/>
                           </pic:cNvPicPr>
                         </pic:nvPicPr>
                         <pic:blipFill>
-                          <a:blip r:embed="rId176"/>
+                          <a:blip r:embed="rId94"/>
                           <a:stretch>
                             <a:fillRect/>
                           </a:stretch>
@@ -20281,7 +18754,7 @@
         </w:tc>
       </w:tr>
     </w:tbl>
-    <w:bookmarkEnd w:id="179"/>
+    <w:bookmarkEnd w:id="97"/>
     <w:sectPr>
       <w:pgSz w:h="15840" w:w="12240"/>
       <w:pgMar w:bottom="1417" w:footer="720" w:gutter="0" w:header="720" w:left="1701" w:right="1701" w:top="1417"/>

</xml_diff>